<commit_message>
JS Module 1: parameterized test cases
</commit_message>
<xml_diff>
--- a/javascript_qa_level_labs/advanced/JavaScript_QA_고급_실습교재.docx
+++ b/javascript_qa_level_labs/advanced/JavaScript_QA_고급_실습교재.docx
@@ -54,7 +54,7 @@
     </w:p>
     <w:p>
       <w:pPr>
-        <w:pStyle w:val="1"/>
+        <w:pStyle w:val="Heading1"/>
         <w:rPr>
           <w:lang w:eastAsia="ko-KR"/>
         </w:rPr>
@@ -124,7 +124,7 @@
     </w:p>
     <w:p>
       <w:pPr>
-        <w:pStyle w:val="1"/>
+        <w:pStyle w:val="Heading1"/>
       </w:pPr>
       <w:r>
         <w:t xml:space="preserve">2. </w:t>
@@ -145,57 +145,35 @@
     </w:p>
     <w:p>
       <w:pPr>
-        <w:pStyle w:val="a0"/>
-        <w:rPr>
-          <w:lang w:eastAsia="ko-KR"/>
-        </w:rPr>
-      </w:pPr>
-      <w:r>
-        <w:rPr>
-          <w:lang w:eastAsia="ko-KR"/>
-        </w:rPr>
-        <w:t xml:space="preserve">TC 데이터를 </w:t>
-      </w:r>
-      <w:proofErr w:type="spellStart"/>
-      <w:r>
-        <w:rPr>
-          <w:lang w:eastAsia="ko-KR"/>
-        </w:rPr>
-        <w:t>파라미터화하여</w:t>
-      </w:r>
-      <w:proofErr w:type="spellEnd"/>
-      <w:r>
-        <w:rPr>
-          <w:lang w:eastAsia="ko-KR"/>
-        </w:rPr>
-        <w:t xml:space="preserve"> 실행 로직과 분리할 수 있다.</w:t>
+        <w:pStyle w:val="ListBullet"/>
+        <w:rPr>
+          <w:lang w:eastAsia="ko-KR"/>
+        </w:rPr>
+      </w:pPr>
+      <w:r>
+        <w:rPr>
+          <w:lang w:eastAsia="ko-KR"/>
+        </w:rPr>
+        <w:t>TC 데이터를 파라미터화하여 실행 로직과 분리할 수 있다.</w:t>
       </w:r>
     </w:p>
     <w:p>
       <w:pPr>
-        <w:pStyle w:val="a0"/>
-        <w:rPr>
-          <w:lang w:eastAsia="ko-KR"/>
-        </w:rPr>
-      </w:pPr>
-      <w:proofErr w:type="spellStart"/>
-      <w:r>
-        <w:rPr>
-          <w:lang w:eastAsia="ko-KR"/>
-        </w:rPr>
-        <w:t>경계값</w:t>
-      </w:r>
-      <w:proofErr w:type="spellEnd"/>
-      <w:r>
-        <w:rPr>
-          <w:lang w:eastAsia="ko-KR"/>
-        </w:rPr>
-        <w:t>/동등분할 관점을 TC 배열로 설계할 수 있다.</w:t>
+        <w:pStyle w:val="ListBullet"/>
+        <w:rPr>
+          <w:lang w:eastAsia="ko-KR"/>
+        </w:rPr>
+      </w:pPr>
+      <w:r>
+        <w:rPr>
+          <w:lang w:eastAsia="ko-KR"/>
+        </w:rPr>
+        <w:t>경계값/동등분할 관점을 TC 배열로 설계할 수 있다.</w:t>
       </w:r>
     </w:p>
     <w:p>
       <w:pPr>
-        <w:pStyle w:val="a0"/>
+        <w:pStyle w:val="ListBullet"/>
         <w:rPr>
           <w:lang w:eastAsia="ko-KR"/>
         </w:rPr>
@@ -209,7 +187,7 @@
     </w:p>
     <w:p>
       <w:pPr>
-        <w:pStyle w:val="a0"/>
+        <w:pStyle w:val="ListBullet"/>
         <w:rPr>
           <w:lang w:eastAsia="ko-KR"/>
         </w:rPr>
@@ -223,7 +201,7 @@
     </w:p>
     <w:p>
       <w:pPr>
-        <w:pStyle w:val="a0"/>
+        <w:pStyle w:val="ListBullet"/>
       </w:pPr>
       <w:r>
         <w:t>filter/reduce/</w:t>
@@ -263,7 +241,7 @@
     </w:p>
     <w:p>
       <w:pPr>
-        <w:pStyle w:val="1"/>
+        <w:pStyle w:val="Heading1"/>
       </w:pPr>
       <w:r>
         <w:t xml:space="preserve">3. </w:t>
@@ -286,7 +264,7 @@
     </w:p>
     <w:tbl>
       <w:tblPr>
-        <w:tblStyle w:val="af9"/>
+        <w:tblStyle w:val="TableGrid"/>
         <w:tblW w:w="0" w:type="auto"/>
         <w:jc w:val="center"/>
         <w:tblLook w:val="04A0" w:firstRow="1" w:lastRow="0" w:firstColumn="1" w:lastColumn="0" w:noHBand="0" w:noVBand="1"/>
@@ -624,27 +602,32 @@
     </w:tbl>
     <w:p>
       <w:pPr>
-        <w:pStyle w:val="1"/>
-      </w:pPr>
-    </w:p>
-    <w:p>
-      <w:pPr>
-        <w:rPr>
-          <w:rFonts w:asciiTheme="majorHAnsi" w:eastAsiaTheme="majorEastAsia" w:hAnsiTheme="majorHAnsi" w:cstheme="majorBidi"/>
+        <w:rPr>
+          <w:rFonts w:asciiTheme="majorHAnsi" w:eastAsia="맑은 고딕" w:hAnsiTheme="majorHAnsi" w:cstheme="majorBidi"/>
           <w:b/>
           <w:bCs/>
           <w:color w:val="5B2C83"/>
           <w:sz w:val="34"/>
           <w:szCs w:val="28"/>
-        </w:rPr>
-      </w:pPr>
-      <w:r>
+          <w:lang w:eastAsia="ko-KR"/>
+        </w:rPr>
+      </w:pPr>
+      <w:r>
+        <w:rPr>
+          <w:rFonts w:asciiTheme="majorHAnsi" w:eastAsia="맑은 고딕" w:hAnsiTheme="majorHAnsi" w:cstheme="majorBidi"/>
+          <w:b/>
+          <w:bCs/>
+          <w:color w:val="5B2C83"/>
+          <w:sz w:val="34"/>
+          <w:szCs w:val="28"/>
+          <w:lang w:eastAsia="ko-KR"/>
+        </w:rPr>
         <w:br w:type="page"/>
       </w:r>
     </w:p>
     <w:p>
       <w:pPr>
-        <w:pStyle w:val="1"/>
+        <w:pStyle w:val="Heading1"/>
       </w:pPr>
       <w:r>
         <w:lastRenderedPageBreak/>
@@ -666,7 +649,7 @@
     </w:p>
     <w:tbl>
       <w:tblPr>
-        <w:tblStyle w:val="af9"/>
+        <w:tblStyle w:val="TableGrid"/>
         <w:tblW w:w="0" w:type="auto"/>
         <w:tblLook w:val="04A0" w:firstRow="1" w:lastRow="0" w:firstColumn="1" w:lastColumn="0" w:noHBand="0" w:noVBand="1"/>
       </w:tblPr>
@@ -967,7 +950,7 @@
     </w:tbl>
     <w:p>
       <w:pPr>
-        <w:pStyle w:val="1"/>
+        <w:pStyle w:val="Heading1"/>
       </w:pPr>
       <w:r>
         <w:t xml:space="preserve">5. </w:t>
@@ -980,7 +963,7 @@
     </w:p>
     <w:p>
       <w:pPr>
-        <w:pStyle w:val="a0"/>
+        <w:pStyle w:val="ListBullet"/>
         <w:rPr>
           <w:lang w:eastAsia="ko-KR"/>
         </w:rPr>
@@ -994,105 +977,49 @@
     </w:p>
     <w:p>
       <w:pPr>
-        <w:pStyle w:val="a0"/>
-        <w:rPr>
-          <w:lang w:eastAsia="ko-KR"/>
-        </w:rPr>
-      </w:pPr>
-      <w:r>
-        <w:rPr>
-          <w:lang w:eastAsia="ko-KR"/>
-        </w:rPr>
-        <w:t xml:space="preserve">한 번 따라한 예제는 </w:t>
-      </w:r>
-      <w:proofErr w:type="spellStart"/>
-      <w:r>
-        <w:rPr>
-          <w:lang w:eastAsia="ko-KR"/>
-        </w:rPr>
-        <w:t>변수명</w:t>
-      </w:r>
-      <w:proofErr w:type="spellEnd"/>
-      <w:r>
-        <w:rPr>
-          <w:lang w:eastAsia="ko-KR"/>
-        </w:rPr>
-        <w:t xml:space="preserve">·데이터·조건을 바꾸어 반드시 다시 </w:t>
-      </w:r>
-      <w:proofErr w:type="gramStart"/>
-      <w:r>
-        <w:rPr>
-          <w:lang w:eastAsia="ko-KR"/>
-        </w:rPr>
-        <w:t>작성 한다</w:t>
-      </w:r>
-      <w:proofErr w:type="gramEnd"/>
-      <w:r>
-        <w:rPr>
-          <w:lang w:eastAsia="ko-KR"/>
-        </w:rPr>
-        <w:t>.</w:t>
+        <w:pStyle w:val="ListBullet"/>
+        <w:rPr>
+          <w:lang w:eastAsia="ko-KR"/>
+        </w:rPr>
+      </w:pPr>
+      <w:r>
+        <w:rPr>
+          <w:lang w:eastAsia="ko-KR"/>
+        </w:rPr>
+        <w:t>한 번 따라한 예제는 변수명·데이터·조건을 바꾸어 반드시 다시 작성 한다.</w:t>
       </w:r>
     </w:p>
     <w:p>
       <w:pPr>
-        <w:pStyle w:val="a0"/>
-        <w:rPr>
-          <w:lang w:eastAsia="ko-KR"/>
-        </w:rPr>
-      </w:pPr>
-      <w:r>
-        <w:rPr>
-          <w:lang w:eastAsia="ko-KR"/>
-        </w:rPr>
-        <w:t xml:space="preserve">오류가 나면 정답을 바로 제시하지 않고 console.log()로 중간 값을 </w:t>
-      </w:r>
-      <w:proofErr w:type="gramStart"/>
-      <w:r>
-        <w:rPr>
-          <w:lang w:eastAsia="ko-KR"/>
-        </w:rPr>
-        <w:t>확인 한다</w:t>
-      </w:r>
-      <w:proofErr w:type="gramEnd"/>
-      <w:r>
-        <w:rPr>
-          <w:lang w:eastAsia="ko-KR"/>
-        </w:rPr>
-        <w:t>.</w:t>
+        <w:pStyle w:val="ListBullet"/>
+        <w:rPr>
+          <w:lang w:eastAsia="ko-KR"/>
+        </w:rPr>
+      </w:pPr>
+      <w:r>
+        <w:rPr>
+          <w:lang w:eastAsia="ko-KR"/>
+        </w:rPr>
+        <w:t>오류가 나면 정답을 바로 제시하지 않고 console.log()로 중간 값을 확인 한다.</w:t>
       </w:r>
     </w:p>
     <w:p>
       <w:pPr>
-        <w:pStyle w:val="a0"/>
-        <w:rPr>
-          <w:lang w:eastAsia="ko-KR"/>
-        </w:rPr>
-      </w:pPr>
-      <w:r>
-        <w:rPr>
-          <w:lang w:eastAsia="ko-KR"/>
-        </w:rPr>
-        <w:t xml:space="preserve">실습 종료 10분 전에는 화면/교재를 덮고 핵심 코드를 다시 </w:t>
-      </w:r>
-      <w:proofErr w:type="gramStart"/>
-      <w:r>
-        <w:rPr>
-          <w:lang w:eastAsia="ko-KR"/>
-        </w:rPr>
-        <w:t>작성 한다</w:t>
-      </w:r>
-      <w:proofErr w:type="gramEnd"/>
-      <w:r>
-        <w:rPr>
-          <w:lang w:eastAsia="ko-KR"/>
-        </w:rPr>
-        <w:t>.</w:t>
+        <w:pStyle w:val="ListBullet"/>
+        <w:rPr>
+          <w:lang w:eastAsia="ko-KR"/>
+        </w:rPr>
+      </w:pPr>
+      <w:r>
+        <w:rPr>
+          <w:lang w:eastAsia="ko-KR"/>
+        </w:rPr>
+        <w:t>실습 종료 10분 전에는 화면/교재를 덮고 핵심 코드를 다시 작성 한다.</w:t>
       </w:r>
     </w:p>
     <w:p>
       <w:pPr>
-        <w:pStyle w:val="a0"/>
+        <w:pStyle w:val="ListBullet"/>
         <w:rPr>
           <w:lang w:eastAsia="ko-KR"/>
         </w:rPr>
@@ -1119,7 +1046,7 @@
     </w:p>
     <w:p>
       <w:pPr>
-        <w:pStyle w:val="1"/>
+        <w:pStyle w:val="Heading1"/>
         <w:rPr>
           <w:lang w:eastAsia="ko-KR"/>
         </w:rPr>
@@ -1151,7 +1078,7 @@
     </w:p>
     <w:p>
       <w:pPr>
-        <w:pStyle w:val="21"/>
+        <w:pStyle w:val="Heading2"/>
         <w:rPr>
           <w:lang w:eastAsia="ko-KR"/>
         </w:rPr>
@@ -1349,7 +1276,7 @@
     </w:p>
     <w:p>
       <w:pPr>
-        <w:pStyle w:val="31"/>
+        <w:pStyle w:val="Heading3"/>
       </w:pPr>
       <w:r>
         <w:t>수행</w:t>
@@ -1363,7 +1290,7 @@
     </w:p>
     <w:p>
       <w:pPr>
-        <w:pStyle w:val="a0"/>
+        <w:pStyle w:val="ListBullet"/>
         <w:rPr>
           <w:lang w:eastAsia="ko-KR"/>
         </w:rPr>
@@ -1377,7 +1304,7 @@
     </w:p>
     <w:p>
       <w:pPr>
-        <w:pStyle w:val="a0"/>
+        <w:pStyle w:val="ListBullet"/>
         <w:rPr>
           <w:lang w:eastAsia="ko-KR"/>
         </w:rPr>
@@ -1391,7 +1318,7 @@
     </w:p>
     <w:p>
       <w:pPr>
-        <w:pStyle w:val="a0"/>
+        <w:pStyle w:val="ListBullet"/>
         <w:rPr>
           <w:lang w:eastAsia="ko-KR"/>
         </w:rPr>
@@ -1405,7 +1332,7 @@
     </w:p>
     <w:p>
       <w:pPr>
-        <w:pStyle w:val="31"/>
+        <w:pStyle w:val="Heading3"/>
       </w:pPr>
       <w:proofErr w:type="spellStart"/>
       <w:r>
@@ -1423,7 +1350,7 @@
     </w:p>
     <w:p>
       <w:pPr>
-        <w:pStyle w:val="a0"/>
+        <w:pStyle w:val="ListBullet"/>
         <w:rPr>
           <w:lang w:eastAsia="ko-KR"/>
         </w:rPr>
@@ -1437,7 +1364,7 @@
     </w:p>
     <w:p>
       <w:pPr>
-        <w:pStyle w:val="31"/>
+        <w:pStyle w:val="Heading3"/>
       </w:pPr>
       <w:proofErr w:type="spellStart"/>
       <w:r>
@@ -1455,7 +1382,7 @@
     </w:p>
     <w:p>
       <w:pPr>
-        <w:pStyle w:val="a0"/>
+        <w:pStyle w:val="ListBullet"/>
         <w:rPr>
           <w:lang w:eastAsia="ko-KR"/>
         </w:rPr>
@@ -1482,7 +1409,7 @@
     </w:p>
     <w:p>
       <w:pPr>
-        <w:pStyle w:val="21"/>
+        <w:pStyle w:val="Heading2"/>
         <w:rPr>
           <w:lang w:eastAsia="ko-KR"/>
         </w:rPr>
@@ -1500,14 +1427,12 @@
         </w:rPr>
         <w:t xml:space="preserve"> 2. </w:t>
       </w:r>
-      <w:proofErr w:type="spellStart"/>
       <w:r>
         <w:rPr>
           <w:lang w:eastAsia="ko-KR"/>
         </w:rPr>
         <w:t>경계값</w:t>
       </w:r>
-      <w:proofErr w:type="spellEnd"/>
       <w:r>
         <w:rPr>
           <w:lang w:eastAsia="ko-KR"/>
@@ -1611,58 +1536,17 @@
       <w:r>
         <w:br/>
       </w:r>
-      <w:proofErr w:type="gramStart"/>
       <w:r>
         <w:rPr>
           <w:rFonts w:ascii="DejaVu Sans Mono" w:eastAsia="DejaVu Sans Mono" w:hAnsi="DejaVu Sans Mono"/>
           <w:sz w:val="16"/>
         </w:rPr>
-        <w:t>console.table</w:t>
-      </w:r>
-      <w:proofErr w:type="gramEnd"/>
-      <w:r>
-        <w:rPr>
-          <w:rFonts w:ascii="DejaVu Sans Mono" w:eastAsia="DejaVu Sans Mono" w:hAnsi="DejaVu Sans Mono"/>
-          <w:sz w:val="16"/>
-        </w:rPr>
-        <w:t>(</w:t>
-      </w:r>
-      <w:proofErr w:type="gramStart"/>
-      <w:r>
-        <w:rPr>
-          <w:rFonts w:ascii="DejaVu Sans Mono" w:eastAsia="DejaVu Sans Mono" w:hAnsi="DejaVu Sans Mono"/>
-          <w:sz w:val="16"/>
-        </w:rPr>
-        <w:t>ages.map(</w:t>
-      </w:r>
-      <w:proofErr w:type="gramEnd"/>
-      <w:r>
-        <w:rPr>
-          <w:rFonts w:ascii="DejaVu Sans Mono" w:eastAsia="DejaVu Sans Mono" w:hAnsi="DejaVu Sans Mono"/>
-          <w:sz w:val="16"/>
-        </w:rPr>
-        <w:t xml:space="preserve">age =&gt; ({age, </w:t>
-      </w:r>
-      <w:proofErr w:type="gramStart"/>
-      <w:r>
-        <w:rPr>
-          <w:rFonts w:ascii="DejaVu Sans Mono" w:eastAsia="DejaVu Sans Mono" w:hAnsi="DejaVu Sans Mono"/>
-          <w:sz w:val="16"/>
-        </w:rPr>
-        <w:t>valid:valid</w:t>
-      </w:r>
-      <w:proofErr w:type="gramEnd"/>
-      <w:r>
-        <w:rPr>
-          <w:rFonts w:ascii="DejaVu Sans Mono" w:eastAsia="DejaVu Sans Mono" w:hAnsi="DejaVu Sans Mono"/>
-          <w:sz w:val="16"/>
-        </w:rPr>
-        <w:t>(age)})));</w:t>
+        <w:t>console.table(ages.map(age =&gt; ({age, valid:valid(age)})));</w:t>
       </w:r>
     </w:p>
     <w:p>
       <w:pPr>
-        <w:pStyle w:val="31"/>
+        <w:pStyle w:val="Heading3"/>
       </w:pPr>
       <w:r>
         <w:t>수행</w:t>
@@ -1676,7 +1560,7 @@
     </w:p>
     <w:p>
       <w:pPr>
-        <w:pStyle w:val="a0"/>
+        <w:pStyle w:val="ListBullet"/>
         <w:rPr>
           <w:lang w:eastAsia="ko-KR"/>
         </w:rPr>
@@ -1690,7 +1574,7 @@
     </w:p>
     <w:p>
       <w:pPr>
-        <w:pStyle w:val="a0"/>
+        <w:pStyle w:val="ListBullet"/>
         <w:rPr>
           <w:lang w:eastAsia="ko-KR"/>
         </w:rPr>
@@ -1704,7 +1588,7 @@
     </w:p>
     <w:p>
       <w:pPr>
-        <w:pStyle w:val="a0"/>
+        <w:pStyle w:val="ListBullet"/>
       </w:pPr>
       <w:proofErr w:type="spellStart"/>
       <w:r>
@@ -1741,7 +1625,7 @@
     </w:p>
     <w:p>
       <w:pPr>
-        <w:pStyle w:val="31"/>
+        <w:pStyle w:val="Heading3"/>
       </w:pPr>
       <w:r>
         <w:t>확인</w:t>
@@ -1755,43 +1639,21 @@
     </w:p>
     <w:p>
       <w:pPr>
-        <w:pStyle w:val="a0"/>
-        <w:rPr>
-          <w:lang w:eastAsia="ko-KR"/>
-        </w:rPr>
-      </w:pPr>
-      <w:proofErr w:type="spellStart"/>
-      <w:r>
-        <w:rPr>
-          <w:lang w:eastAsia="ko-KR"/>
-        </w:rPr>
-        <w:t>경계값을</w:t>
-      </w:r>
-      <w:proofErr w:type="spellEnd"/>
-      <w:r>
-        <w:rPr>
-          <w:lang w:eastAsia="ko-KR"/>
-        </w:rPr>
-        <w:t xml:space="preserve"> 임의의 </w:t>
-      </w:r>
-      <w:proofErr w:type="spellStart"/>
-      <w:r>
-        <w:rPr>
-          <w:lang w:eastAsia="ko-KR"/>
-        </w:rPr>
-        <w:t>정상값보다</w:t>
-      </w:r>
-      <w:proofErr w:type="spellEnd"/>
-      <w:r>
-        <w:rPr>
-          <w:lang w:eastAsia="ko-KR"/>
-        </w:rPr>
-        <w:t xml:space="preserve"> 먼저 테스트하는 이유는 무엇인가?</w:t>
+        <w:pStyle w:val="ListBullet"/>
+        <w:rPr>
+          <w:lang w:eastAsia="ko-KR"/>
+        </w:rPr>
+      </w:pPr>
+      <w:r>
+        <w:rPr>
+          <w:lang w:eastAsia="ko-KR"/>
+        </w:rPr>
+        <w:t>경계값을 임의의 정상값보다 먼저 테스트하는 이유는 무엇인가?</w:t>
       </w:r>
     </w:p>
     <w:p>
       <w:pPr>
-        <w:pStyle w:val="31"/>
+        <w:pStyle w:val="Heading3"/>
       </w:pPr>
       <w:proofErr w:type="spellStart"/>
       <w:r>
@@ -1809,7 +1671,7 @@
     </w:p>
     <w:p>
       <w:pPr>
-        <w:pStyle w:val="a0"/>
+        <w:pStyle w:val="ListBullet"/>
         <w:rPr>
           <w:lang w:eastAsia="ko-KR"/>
         </w:rPr>
@@ -1842,7 +1704,7 @@
     </w:p>
     <w:p>
       <w:pPr>
-        <w:pStyle w:val="21"/>
+        <w:pStyle w:val="Heading2"/>
         <w:rPr>
           <w:lang w:eastAsia="ko-KR"/>
         </w:rPr>
@@ -1917,13 +1779,8 @@
         <w:t xml:space="preserve">: </w:t>
       </w:r>
       <w:r>
-        <w:t xml:space="preserve">JSON + Object + Array </w:t>
-      </w:r>
-      <w:proofErr w:type="gramStart"/>
-      <w:r>
-        <w:t>includes</w:t>
-      </w:r>
-      <w:proofErr w:type="gramEnd"/>
+        <w:t>JSON + Object + Array includes</w:t>
+      </w:r>
     </w:p>
     <w:p>
       <w:pPr>
@@ -2001,7 +1858,7 @@
     </w:p>
     <w:p>
       <w:pPr>
-        <w:pStyle w:val="31"/>
+        <w:pStyle w:val="Heading3"/>
       </w:pPr>
       <w:r>
         <w:t>수행</w:t>
@@ -2015,7 +1872,7 @@
     </w:p>
     <w:p>
       <w:pPr>
-        <w:pStyle w:val="a0"/>
+        <w:pStyle w:val="ListBullet"/>
         <w:rPr>
           <w:lang w:eastAsia="ko-KR"/>
         </w:rPr>
@@ -2029,7 +1886,7 @@
     </w:p>
     <w:p>
       <w:pPr>
-        <w:pStyle w:val="a0"/>
+        <w:pStyle w:val="ListBullet"/>
         <w:rPr>
           <w:lang w:eastAsia="ko-KR"/>
         </w:rPr>
@@ -2057,7 +1914,7 @@
     </w:p>
     <w:p>
       <w:pPr>
-        <w:pStyle w:val="a0"/>
+        <w:pStyle w:val="ListBullet"/>
         <w:rPr>
           <w:lang w:eastAsia="ko-KR"/>
         </w:rPr>
@@ -2071,7 +1928,7 @@
     </w:p>
     <w:p>
       <w:pPr>
-        <w:pStyle w:val="31"/>
+        <w:pStyle w:val="Heading3"/>
       </w:pPr>
       <w:proofErr w:type="spellStart"/>
       <w:r>
@@ -2089,7 +1946,7 @@
     </w:p>
     <w:p>
       <w:pPr>
-        <w:pStyle w:val="a0"/>
+        <w:pStyle w:val="ListBullet"/>
         <w:rPr>
           <w:lang w:eastAsia="ko-KR"/>
         </w:rPr>
@@ -2103,7 +1960,7 @@
     </w:p>
     <w:p>
       <w:pPr>
-        <w:pStyle w:val="31"/>
+        <w:pStyle w:val="Heading3"/>
       </w:pPr>
       <w:proofErr w:type="spellStart"/>
       <w:r>
@@ -2121,7 +1978,7 @@
     </w:p>
     <w:p>
       <w:pPr>
-        <w:pStyle w:val="a0"/>
+        <w:pStyle w:val="ListBullet"/>
         <w:rPr>
           <w:lang w:eastAsia="ko-KR"/>
         </w:rPr>
@@ -2145,7 +2002,6 @@
         </w:rPr>
         <w:t xml:space="preserve">실제 HTTP 호출은 </w:t>
       </w:r>
-      <w:proofErr w:type="gramStart"/>
       <w:r>
         <w:rPr>
           <w:rFonts w:ascii="맑은 고딕" w:eastAsia="맑은 고딕" w:hAnsi="맑은 고딕" w:cs="맑은 고딕" w:hint="eastAsia"/>
@@ -2157,14 +2013,7 @@
         <w:rPr>
           <w:lang w:eastAsia="ko-KR"/>
         </w:rPr>
-        <w:t xml:space="preserve"> 본</w:t>
-      </w:r>
-      <w:proofErr w:type="gramEnd"/>
-      <w:r>
-        <w:rPr>
-          <w:lang w:eastAsia="ko-KR"/>
-        </w:rPr>
-        <w:t xml:space="preserve"> 교재에서는 응답 객체 자체의 검증에 집중한다.</w:t>
+        <w:t xml:space="preserve"> 본 교재에서는 응답 객체 자체의 검증에 집중한다.</w:t>
       </w:r>
     </w:p>
     <w:p>
@@ -2176,15 +2025,19 @@
           <w:color w:val="2F5597"/>
           <w:sz w:val="26"/>
           <w:szCs w:val="26"/>
-        </w:rPr>
-      </w:pPr>
-      <w:r>
+          <w:lang w:eastAsia="ko-KR"/>
+        </w:rPr>
+      </w:pPr>
+      <w:r>
+        <w:rPr>
+          <w:lang w:eastAsia="ko-KR"/>
+        </w:rPr>
         <w:br w:type="page"/>
       </w:r>
     </w:p>
     <w:p>
       <w:pPr>
-        <w:pStyle w:val="21"/>
+        <w:pStyle w:val="Heading2"/>
       </w:pPr>
       <w:proofErr w:type="spellStart"/>
       <w:r>
@@ -2315,7 +2168,7 @@
     </w:p>
     <w:p>
       <w:pPr>
-        <w:pStyle w:val="31"/>
+        <w:pStyle w:val="Heading3"/>
       </w:pPr>
       <w:r>
         <w:t>수행</w:t>
@@ -2329,7 +2182,7 @@
     </w:p>
     <w:p>
       <w:pPr>
-        <w:pStyle w:val="a0"/>
+        <w:pStyle w:val="ListBullet"/>
         <w:rPr>
           <w:lang w:eastAsia="ko-KR"/>
         </w:rPr>
@@ -2343,7 +2196,7 @@
     </w:p>
     <w:p>
       <w:pPr>
-        <w:pStyle w:val="a0"/>
+        <w:pStyle w:val="ListBullet"/>
         <w:rPr>
           <w:lang w:eastAsia="ko-KR"/>
         </w:rPr>
@@ -2357,13 +2210,12 @@
     </w:p>
     <w:p>
       <w:pPr>
-        <w:pStyle w:val="a0"/>
+        <w:pStyle w:val="ListBullet"/>
         <w:rPr>
           <w:lang w:eastAsia="ko-KR"/>
         </w:rPr>
       </w:pPr>
       <w:proofErr w:type="spellStart"/>
-      <w:proofErr w:type="gramStart"/>
       <w:r>
         <w:rPr>
           <w:lang w:eastAsia="ko-KR"/>
@@ -2371,7 +2223,6 @@
         <w:t>console.table</w:t>
       </w:r>
       <w:proofErr w:type="spellEnd"/>
-      <w:proofErr w:type="gramEnd"/>
       <w:r>
         <w:rPr>
           <w:lang w:eastAsia="ko-KR"/>
@@ -2381,7 +2232,7 @@
     </w:p>
     <w:p>
       <w:pPr>
-        <w:pStyle w:val="31"/>
+        <w:pStyle w:val="Heading3"/>
       </w:pPr>
       <w:proofErr w:type="spellStart"/>
       <w:r>
@@ -2399,7 +2250,7 @@
     </w:p>
     <w:p>
       <w:pPr>
-        <w:pStyle w:val="a0"/>
+        <w:pStyle w:val="ListBullet"/>
         <w:rPr>
           <w:lang w:eastAsia="ko-KR"/>
         </w:rPr>
@@ -2413,7 +2264,7 @@
     </w:p>
     <w:p>
       <w:pPr>
-        <w:pStyle w:val="31"/>
+        <w:pStyle w:val="Heading3"/>
       </w:pPr>
       <w:proofErr w:type="spellStart"/>
       <w:r>
@@ -2431,7 +2282,7 @@
     </w:p>
     <w:p>
       <w:pPr>
-        <w:pStyle w:val="a0"/>
+        <w:pStyle w:val="ListBullet"/>
         <w:rPr>
           <w:lang w:eastAsia="ko-KR"/>
         </w:rPr>
@@ -2477,7 +2328,6 @@
         </w:rPr>
         <w:t xml:space="preserve">try-catch와 테스트 프레임워크 개념은 </w:t>
       </w:r>
-      <w:proofErr w:type="spellStart"/>
       <w:r>
         <w:rPr>
           <w:rFonts w:ascii="맑은 고딕" w:eastAsia="맑은 고딕" w:hAnsi="맑은 고딕" w:cs="맑은 고딕" w:hint="eastAsia"/>
@@ -2485,7 +2335,6 @@
         </w:rPr>
         <w:t>추가학습한다</w:t>
       </w:r>
-      <w:proofErr w:type="spellEnd"/>
     </w:p>
     <w:p>
       <w:pPr>
@@ -2508,7 +2357,7 @@
     </w:p>
     <w:p>
       <w:pPr>
-        <w:pStyle w:val="21"/>
+        <w:pStyle w:val="Heading2"/>
         <w:rPr>
           <w:lang w:eastAsia="ko-KR"/>
         </w:rPr>
@@ -2574,21 +2423,7 @@
         <w:rPr>
           <w:lang w:eastAsia="ko-KR"/>
         </w:rPr>
-        <w:t xml:space="preserve">TC 결과를 집계하여 자동화 결과물로 </w:t>
-      </w:r>
-      <w:proofErr w:type="spellStart"/>
-      <w:r>
-        <w:rPr>
-          <w:lang w:eastAsia="ko-KR"/>
-        </w:rPr>
-        <w:t>구조화한다</w:t>
-      </w:r>
-      <w:proofErr w:type="spellEnd"/>
-      <w:r>
-        <w:rPr>
-          <w:lang w:eastAsia="ko-KR"/>
-        </w:rPr>
-        <w:t>.</w:t>
+        <w:t>TC 결과를 집계하여 자동화 결과물로 구조화한다.</w:t>
       </w:r>
     </w:p>
     <w:p>
@@ -2745,7 +2580,7 @@
     </w:p>
     <w:p>
       <w:pPr>
-        <w:pStyle w:val="31"/>
+        <w:pStyle w:val="Heading3"/>
       </w:pPr>
       <w:r>
         <w:t>수행</w:t>
@@ -2759,7 +2594,7 @@
     </w:p>
     <w:p>
       <w:pPr>
-        <w:pStyle w:val="a0"/>
+        <w:pStyle w:val="ListBullet"/>
         <w:rPr>
           <w:lang w:eastAsia="ko-KR"/>
         </w:rPr>
@@ -2773,7 +2608,7 @@
     </w:p>
     <w:p>
       <w:pPr>
-        <w:pStyle w:val="a0"/>
+        <w:pStyle w:val="ListBullet"/>
         <w:rPr>
           <w:lang w:eastAsia="ko-KR"/>
         </w:rPr>
@@ -2787,7 +2622,7 @@
     </w:p>
     <w:p>
       <w:pPr>
-        <w:pStyle w:val="a0"/>
+        <w:pStyle w:val="ListBullet"/>
         <w:rPr>
           <w:lang w:eastAsia="ko-KR"/>
         </w:rPr>
@@ -2801,7 +2636,7 @@
     </w:p>
     <w:p>
       <w:pPr>
-        <w:pStyle w:val="31"/>
+        <w:pStyle w:val="Heading3"/>
       </w:pPr>
       <w:proofErr w:type="spellStart"/>
       <w:r>
@@ -2819,7 +2654,7 @@
     </w:p>
     <w:p>
       <w:pPr>
-        <w:pStyle w:val="a0"/>
+        <w:pStyle w:val="ListBullet"/>
         <w:rPr>
           <w:lang w:eastAsia="ko-KR"/>
         </w:rPr>
@@ -2833,7 +2668,7 @@
     </w:p>
     <w:p>
       <w:pPr>
-        <w:pStyle w:val="31"/>
+        <w:pStyle w:val="Heading3"/>
       </w:pPr>
       <w:proofErr w:type="spellStart"/>
       <w:r>
@@ -2851,7 +2686,7 @@
     </w:p>
     <w:p>
       <w:pPr>
-        <w:pStyle w:val="a0"/>
+        <w:pStyle w:val="ListBullet"/>
         <w:rPr>
           <w:lang w:eastAsia="ko-KR"/>
         </w:rPr>
@@ -2884,7 +2719,7 @@
     </w:p>
     <w:p>
       <w:pPr>
-        <w:pStyle w:val="21"/>
+        <w:pStyle w:val="Heading2"/>
         <w:rPr>
           <w:lang w:eastAsia="ko-KR"/>
         </w:rPr>
@@ -3084,7 +2919,7 @@
     </w:p>
     <w:p>
       <w:pPr>
-        <w:pStyle w:val="31"/>
+        <w:pStyle w:val="Heading3"/>
       </w:pPr>
       <w:r>
         <w:t>수행</w:t>
@@ -3098,7 +2933,7 @@
     </w:p>
     <w:p>
       <w:pPr>
-        <w:pStyle w:val="a0"/>
+        <w:pStyle w:val="ListBullet"/>
         <w:rPr>
           <w:lang w:eastAsia="ko-KR"/>
         </w:rPr>
@@ -3112,7 +2947,7 @@
     </w:p>
     <w:p>
       <w:pPr>
-        <w:pStyle w:val="a0"/>
+        <w:pStyle w:val="ListBullet"/>
         <w:rPr>
           <w:lang w:eastAsia="ko-KR"/>
         </w:rPr>
@@ -3126,7 +2961,7 @@
     </w:p>
     <w:p>
       <w:pPr>
-        <w:pStyle w:val="a0"/>
+        <w:pStyle w:val="ListBullet"/>
       </w:pPr>
       <w:r>
         <w:t xml:space="preserve">FAIL </w:t>
@@ -3158,7 +2993,7 @@
     </w:p>
     <w:p>
       <w:pPr>
-        <w:pStyle w:val="a0"/>
+        <w:pStyle w:val="ListBullet"/>
         <w:rPr>
           <w:lang w:eastAsia="ko-KR"/>
         </w:rPr>
@@ -3172,7 +3007,7 @@
     </w:p>
     <w:p>
       <w:pPr>
-        <w:pStyle w:val="31"/>
+        <w:pStyle w:val="Heading3"/>
       </w:pPr>
       <w:proofErr w:type="spellStart"/>
       <w:r>
@@ -3190,7 +3025,7 @@
     </w:p>
     <w:p>
       <w:pPr>
-        <w:pStyle w:val="a0"/>
+        <w:pStyle w:val="ListBullet"/>
         <w:rPr>
           <w:lang w:eastAsia="ko-KR"/>
         </w:rPr>
@@ -3204,7 +3039,7 @@
     </w:p>
     <w:p>
       <w:pPr>
-        <w:pStyle w:val="31"/>
+        <w:pStyle w:val="Heading3"/>
       </w:pPr>
       <w:proofErr w:type="spellStart"/>
       <w:r>
@@ -3222,7 +3057,7 @@
     </w:p>
     <w:p>
       <w:pPr>
-        <w:pStyle w:val="a0"/>
+        <w:pStyle w:val="ListBullet"/>
         <w:rPr>
           <w:lang w:eastAsia="ko-KR"/>
         </w:rPr>
@@ -3255,7 +3090,7 @@
     </w:p>
     <w:p>
       <w:pPr>
-        <w:pStyle w:val="1"/>
+        <w:pStyle w:val="Heading1"/>
         <w:rPr>
           <w:lang w:eastAsia="ko-KR"/>
         </w:rPr>
@@ -3349,7 +3184,7 @@
     </w:p>
     <w:p>
       <w:pPr>
-        <w:pStyle w:val="a0"/>
+        <w:pStyle w:val="ListBullet"/>
         <w:rPr>
           <w:lang w:eastAsia="ko-KR"/>
         </w:rPr>
@@ -3363,7 +3198,7 @@
     </w:p>
     <w:p>
       <w:pPr>
-        <w:pStyle w:val="a0"/>
+        <w:pStyle w:val="ListBullet"/>
         <w:rPr>
           <w:lang w:eastAsia="ko-KR"/>
         </w:rPr>
@@ -3377,7 +3212,7 @@
     </w:p>
     <w:p>
       <w:pPr>
-        <w:pStyle w:val="a0"/>
+        <w:pStyle w:val="ListBullet"/>
       </w:pPr>
       <w:proofErr w:type="spellStart"/>
       <w:r>
@@ -3414,7 +3249,7 @@
     </w:p>
     <w:p>
       <w:pPr>
-        <w:pStyle w:val="a0"/>
+        <w:pStyle w:val="ListBullet"/>
         <w:rPr>
           <w:lang w:eastAsia="ko-KR"/>
         </w:rPr>
@@ -3428,7 +3263,7 @@
     </w:p>
     <w:p>
       <w:pPr>
-        <w:pStyle w:val="a0"/>
+        <w:pStyle w:val="ListBullet"/>
         <w:rPr>
           <w:lang w:eastAsia="ko-KR"/>
         </w:rPr>
@@ -3442,7 +3277,7 @@
     </w:p>
     <w:p>
       <w:pPr>
-        <w:pStyle w:val="1"/>
+        <w:pStyle w:val="Heading1"/>
       </w:pPr>
       <w:r>
         <w:t xml:space="preserve">8. </w:t>
@@ -3462,7 +3297,7 @@
     </w:p>
     <w:tbl>
       <w:tblPr>
-        <w:tblStyle w:val="af9"/>
+        <w:tblStyle w:val="TableGrid"/>
         <w:tblW w:w="0" w:type="auto"/>
         <w:tblLook w:val="04A0" w:firstRow="1" w:lastRow="0" w:firstColumn="1" w:lastColumn="0" w:noHBand="0" w:noVBand="1"/>
       </w:tblPr>
@@ -3661,23 +3496,7 @@
                 <w:sz w:val="16"/>
                 <w:lang w:eastAsia="ko-KR"/>
               </w:rPr>
-              <w:t xml:space="preserve">console을 이용해 오류 위치와 </w:t>
-            </w:r>
-            <w:proofErr w:type="spellStart"/>
-            <w:r>
-              <w:rPr>
-                <w:sz w:val="16"/>
-                <w:lang w:eastAsia="ko-KR"/>
-              </w:rPr>
-              <w:t>중간값을</w:t>
-            </w:r>
-            <w:proofErr w:type="spellEnd"/>
-            <w:r>
-              <w:rPr>
-                <w:sz w:val="16"/>
-                <w:lang w:eastAsia="ko-KR"/>
-              </w:rPr>
-              <w:t xml:space="preserve"> 확인함</w:t>
+              <w:t>console을 이용해 오류 위치와 중간값을 확인함</w:t>
             </w:r>
           </w:p>
         </w:tc>
@@ -3882,17 +3701,8 @@
                 <w:sz w:val="16"/>
                 <w:lang w:eastAsia="ko-KR"/>
               </w:rPr>
-              <w:t xml:space="preserve">교재 없이 핵심 실습을 </w:t>
+              <w:t>교재 없이 핵심 실습을 재작성함</w:t>
             </w:r>
-            <w:proofErr w:type="spellStart"/>
-            <w:r>
-              <w:rPr>
-                <w:sz w:val="16"/>
-                <w:lang w:eastAsia="ko-KR"/>
-              </w:rPr>
-              <w:t>재작성함</w:t>
-            </w:r>
-            <w:proofErr w:type="spellEnd"/>
           </w:p>
         </w:tc>
         <w:tc>
@@ -3928,7 +3738,7 @@
     </w:tbl>
     <w:p>
       <w:pPr>
-        <w:pStyle w:val="1"/>
+        <w:pStyle w:val="Heading1"/>
         <w:rPr>
           <w:lang w:eastAsia="ko-KR"/>
         </w:rPr>
@@ -4172,7 +3982,7 @@
 <w:ftr xmlns:wpc="http://schemas.microsoft.com/office/word/2010/wordprocessingCanvas" xmlns:cx="http://schemas.microsoft.com/office/drawing/2014/chartex" xmlns:cx1="http://schemas.microsoft.com/office/drawing/2015/9/8/chartex" xmlns:cx2="http://schemas.microsoft.com/office/drawing/2015/10/21/chartex" xmlns:cx3="http://schemas.microsoft.com/office/drawing/2016/5/9/chartex" xmlns:cx4="http://schemas.microsoft.com/office/drawing/2016/5/10/chartex" xmlns:cx5="http://schemas.microsoft.com/office/drawing/2016/5/11/chartex" xmlns:cx6="http://schemas.microsoft.com/office/drawing/2016/5/12/chartex" xmlns:cx7="http://schemas.microsoft.com/office/drawing/2016/5/13/chartex" xmlns:cx8="http://schemas.microsoft.com/office/drawing/2016/5/14/chartex" xmlns:mc="http://schemas.openxmlformats.org/markup-compatibility/2006" xmlns:aink="http://schemas.microsoft.com/office/drawing/2016/ink" xmlns:am3d="http://schemas.microsoft.com/office/drawing/2017/model3d" xmlns:o="urn:schemas-microsoft-com:office:office" xmlns:oel="http://schemas.microsoft.com/office/2019/extlst" xmlns:r="http://schemas.openxmlformats.org/officeDocument/2006/relationships" xmlns:m="http://schemas.openxmlformats.org/officeDocument/2006/math" xmlns:v="urn:schemas-microsoft-com:vml" xmlns:wp14="http://schemas.microsoft.com/office/word/2010/wordprocessingDrawing" xmlns:wp="http://schemas.openxmlformats.org/drawingml/2006/wordprocessingDrawing" xmlns:w10="urn:schemas-microsoft-com:office:word" xmlns:w="http://schemas.openxmlformats.org/wordprocessingml/2006/main" xmlns:w14="http://schemas.microsoft.com/office/word/2010/wordml" xmlns:w15="http://schemas.microsoft.com/office/word/2012/wordml" xmlns:w16cex="http://schemas.microsoft.com/office/word/2018/wordml/cex" xmlns:w16cid="http://schemas.microsoft.com/office/word/2016/wordml/cid" xmlns:w16="http://schemas.microsoft.com/office/word/2018/wordml" xmlns:w16du="http://schemas.microsoft.com/office/word/2023/wordml/word16du" xmlns:w16sdtdh="http://schemas.microsoft.com/office/word/2020/wordml/sdtdatahash" xmlns:w16sdtfl="http://schemas.microsoft.com/office/word/2024/wordml/sdtformatlock" xmlns:w16se="http://schemas.microsoft.com/office/word/2015/wordml/symex" xmlns:wpg="http://schemas.microsoft.com/office/word/2010/wordprocessingGroup" xmlns:wpi="http://schemas.microsoft.com/office/word/2010/wordprocessingInk" xmlns:wne="http://schemas.microsoft.com/office/word/2006/wordml" xmlns:wps="http://schemas.microsoft.com/office/word/2010/wordprocessingShape" mc:Ignorable="w14 w15 w16se w16cid w16 w16cex w16sdtdh w16sdtfl w16du wp14">
   <w:p>
     <w:pPr>
-      <w:pStyle w:val="a6"/>
+      <w:pStyle w:val="Footer"/>
       <w:jc w:val="center"/>
       <w:rPr>
         <w:lang w:eastAsia="ko-KR"/>
@@ -4258,7 +4068,7 @@
     <w:lvl w:ilvl="0">
       <w:start w:val="1"/>
       <w:numFmt w:val="decimal"/>
-      <w:pStyle w:val="3"/>
+      <w:pStyle w:val="ListNumber3"/>
       <w:lvlText w:val="%1."/>
       <w:lvlJc w:val="left"/>
       <w:pPr>
@@ -4276,7 +4086,7 @@
     <w:lvl w:ilvl="0">
       <w:start w:val="1"/>
       <w:numFmt w:val="decimal"/>
-      <w:pStyle w:val="2"/>
+      <w:pStyle w:val="ListNumber2"/>
       <w:lvlText w:val="%1."/>
       <w:lvlJc w:val="left"/>
       <w:pPr>
@@ -4314,7 +4124,7 @@
     <w:lvl w:ilvl="0">
       <w:start w:val="1"/>
       <w:numFmt w:val="bullet"/>
-      <w:pStyle w:val="30"/>
+      <w:pStyle w:val="ListBullet3"/>
       <w:lvlText w:val=""/>
       <w:lvlJc w:val="left"/>
       <w:pPr>
@@ -4335,7 +4145,7 @@
     <w:lvl w:ilvl="0">
       <w:start w:val="1"/>
       <w:numFmt w:val="bullet"/>
-      <w:pStyle w:val="20"/>
+      <w:pStyle w:val="ListBullet2"/>
       <w:lvlText w:val=""/>
       <w:lvlJc w:val="left"/>
       <w:pPr>
@@ -4356,7 +4166,7 @@
     <w:lvl w:ilvl="0">
       <w:start w:val="1"/>
       <w:numFmt w:val="decimal"/>
-      <w:pStyle w:val="a"/>
+      <w:pStyle w:val="ListNumber"/>
       <w:lvlText w:val="%1."/>
       <w:lvlJc w:val="left"/>
       <w:pPr>
@@ -4374,7 +4184,7 @@
     <w:lvl w:ilvl="0">
       <w:start w:val="1"/>
       <w:numFmt w:val="bullet"/>
-      <w:pStyle w:val="a0"/>
+      <w:pStyle w:val="ListBullet"/>
       <w:lvlText w:val=""/>
       <w:lvlJc w:val="left"/>
       <w:pPr>
@@ -4804,7 +4614,7 @@
     <w:lsdException w:name="Unresolved Mention" w:semiHidden="1" w:unhideWhenUsed="1"/>
     <w:lsdException w:name="Smart Link" w:semiHidden="1" w:unhideWhenUsed="1"/>
   </w:latentStyles>
-  <w:style w:type="paragraph" w:default="1" w:styleId="a1">
+  <w:style w:type="paragraph" w:default="1" w:styleId="Normal">
     <w:name w:val="Normal"/>
     <w:qFormat/>
     <w:rsid w:val="00FC693F"/>
@@ -4813,11 +4623,11 @@
       <w:sz w:val="19"/>
     </w:rPr>
   </w:style>
-  <w:style w:type="paragraph" w:styleId="1">
+  <w:style w:type="paragraph" w:styleId="Heading1">
     <w:name w:val="heading 1"/>
-    <w:basedOn w:val="a1"/>
-    <w:next w:val="a1"/>
-    <w:link w:val="1Char"/>
+    <w:basedOn w:val="Normal"/>
+    <w:next w:val="Normal"/>
+    <w:link w:val="Heading1Char"/>
     <w:uiPriority w:val="9"/>
     <w:qFormat/>
     <w:rsid w:val="00FC693F"/>
@@ -4836,11 +4646,11 @@
       <w:szCs w:val="28"/>
     </w:rPr>
   </w:style>
-  <w:style w:type="paragraph" w:styleId="21">
+  <w:style w:type="paragraph" w:styleId="Heading2">
     <w:name w:val="heading 2"/>
-    <w:basedOn w:val="a1"/>
-    <w:next w:val="a1"/>
-    <w:link w:val="2Char"/>
+    <w:basedOn w:val="Normal"/>
+    <w:next w:val="Normal"/>
+    <w:link w:val="Heading2Char"/>
     <w:uiPriority w:val="9"/>
     <w:unhideWhenUsed/>
     <w:qFormat/>
@@ -4860,11 +4670,11 @@
       <w:szCs w:val="26"/>
     </w:rPr>
   </w:style>
-  <w:style w:type="paragraph" w:styleId="31">
+  <w:style w:type="paragraph" w:styleId="Heading3">
     <w:name w:val="heading 3"/>
-    <w:basedOn w:val="a1"/>
-    <w:next w:val="a1"/>
-    <w:link w:val="3Char"/>
+    <w:basedOn w:val="Normal"/>
+    <w:next w:val="Normal"/>
+    <w:link w:val="Heading3Char"/>
     <w:uiPriority w:val="9"/>
     <w:unhideWhenUsed/>
     <w:qFormat/>
@@ -4883,11 +4693,11 @@
       <w:sz w:val="22"/>
     </w:rPr>
   </w:style>
-  <w:style w:type="paragraph" w:styleId="4">
+  <w:style w:type="paragraph" w:styleId="Heading4">
     <w:name w:val="heading 4"/>
-    <w:basedOn w:val="a1"/>
-    <w:next w:val="a1"/>
-    <w:link w:val="4Char"/>
+    <w:basedOn w:val="Normal"/>
+    <w:next w:val="Normal"/>
+    <w:link w:val="Heading4Char"/>
     <w:uiPriority w:val="9"/>
     <w:semiHidden/>
     <w:unhideWhenUsed/>
@@ -4908,11 +4718,11 @@
       <w:color w:val="4F81BD" w:themeColor="accent1"/>
     </w:rPr>
   </w:style>
-  <w:style w:type="paragraph" w:styleId="5">
+  <w:style w:type="paragraph" w:styleId="Heading5">
     <w:name w:val="heading 5"/>
-    <w:basedOn w:val="a1"/>
-    <w:next w:val="a1"/>
-    <w:link w:val="5Char"/>
+    <w:basedOn w:val="Normal"/>
+    <w:next w:val="Normal"/>
+    <w:link w:val="Heading5Char"/>
     <w:uiPriority w:val="9"/>
     <w:semiHidden/>
     <w:unhideWhenUsed/>
@@ -4929,11 +4739,11 @@
       <w:color w:val="243F60" w:themeColor="accent1" w:themeShade="7F"/>
     </w:rPr>
   </w:style>
-  <w:style w:type="paragraph" w:styleId="6">
+  <w:style w:type="paragraph" w:styleId="Heading6">
     <w:name w:val="heading 6"/>
-    <w:basedOn w:val="a1"/>
-    <w:next w:val="a1"/>
-    <w:link w:val="6Char"/>
+    <w:basedOn w:val="Normal"/>
+    <w:next w:val="Normal"/>
+    <w:link w:val="Heading6Char"/>
     <w:uiPriority w:val="9"/>
     <w:semiHidden/>
     <w:unhideWhenUsed/>
@@ -4952,11 +4762,11 @@
       <w:color w:val="243F60" w:themeColor="accent1" w:themeShade="7F"/>
     </w:rPr>
   </w:style>
-  <w:style w:type="paragraph" w:styleId="7">
+  <w:style w:type="paragraph" w:styleId="Heading7">
     <w:name w:val="heading 7"/>
-    <w:basedOn w:val="a1"/>
-    <w:next w:val="a1"/>
-    <w:link w:val="7Char"/>
+    <w:basedOn w:val="Normal"/>
+    <w:next w:val="Normal"/>
+    <w:link w:val="Heading7Char"/>
     <w:uiPriority w:val="9"/>
     <w:semiHidden/>
     <w:unhideWhenUsed/>
@@ -4975,11 +4785,11 @@
       <w:color w:val="404040" w:themeColor="text1" w:themeTint="BF"/>
     </w:rPr>
   </w:style>
-  <w:style w:type="paragraph" w:styleId="8">
+  <w:style w:type="paragraph" w:styleId="Heading8">
     <w:name w:val="heading 8"/>
-    <w:basedOn w:val="a1"/>
-    <w:next w:val="a1"/>
-    <w:link w:val="8Char"/>
+    <w:basedOn w:val="Normal"/>
+    <w:next w:val="Normal"/>
+    <w:link w:val="Heading8Char"/>
     <w:uiPriority w:val="9"/>
     <w:semiHidden/>
     <w:unhideWhenUsed/>
@@ -4998,11 +4808,11 @@
       <w:szCs w:val="20"/>
     </w:rPr>
   </w:style>
-  <w:style w:type="paragraph" w:styleId="9">
+  <w:style w:type="paragraph" w:styleId="Heading9">
     <w:name w:val="heading 9"/>
-    <w:basedOn w:val="a1"/>
-    <w:next w:val="a1"/>
-    <w:link w:val="9Char"/>
+    <w:basedOn w:val="Normal"/>
+    <w:next w:val="Normal"/>
+    <w:link w:val="Heading9Char"/>
     <w:uiPriority w:val="9"/>
     <w:semiHidden/>
     <w:unhideWhenUsed/>
@@ -5023,13 +4833,13 @@
       <w:szCs w:val="20"/>
     </w:rPr>
   </w:style>
-  <w:style w:type="character" w:default="1" w:styleId="a2">
+  <w:style w:type="character" w:default="1" w:styleId="DefaultParagraphFont">
     <w:name w:val="Default Paragraph Font"/>
     <w:uiPriority w:val="1"/>
     <w:semiHidden/>
     <w:unhideWhenUsed/>
   </w:style>
-  <w:style w:type="table" w:default="1" w:styleId="a3">
+  <w:style w:type="table" w:default="1" w:styleId="TableNormal">
     <w:name w:val="Normal Table"/>
     <w:uiPriority w:val="99"/>
     <w:semiHidden/>
@@ -5044,16 +4854,16 @@
       </w:tblCellMar>
     </w:tblPr>
   </w:style>
-  <w:style w:type="numbering" w:default="1" w:styleId="a4">
+  <w:style w:type="numbering" w:default="1" w:styleId="NoList">
     <w:name w:val="No List"/>
     <w:uiPriority w:val="99"/>
     <w:semiHidden/>
     <w:unhideWhenUsed/>
   </w:style>
-  <w:style w:type="paragraph" w:styleId="a5">
+  <w:style w:type="paragraph" w:styleId="Header">
     <w:name w:val="header"/>
-    <w:basedOn w:val="a1"/>
-    <w:link w:val="Char"/>
+    <w:basedOn w:val="Normal"/>
+    <w:link w:val="HeaderChar"/>
     <w:uiPriority w:val="99"/>
     <w:unhideWhenUsed/>
     <w:rsid w:val="00E618BF"/>
@@ -5065,17 +4875,17 @@
       <w:spacing w:after="0" w:line="240" w:lineRule="auto"/>
     </w:pPr>
   </w:style>
-  <w:style w:type="character" w:customStyle="1" w:styleId="Char">
-    <w:name w:val="머리글 Char"/>
-    <w:basedOn w:val="a2"/>
-    <w:link w:val="a5"/>
+  <w:style w:type="character" w:customStyle="1" w:styleId="HeaderChar">
+    <w:name w:val="Header Char"/>
+    <w:basedOn w:val="DefaultParagraphFont"/>
+    <w:link w:val="Header"/>
     <w:uiPriority w:val="99"/>
     <w:rsid w:val="00E618BF"/>
   </w:style>
-  <w:style w:type="paragraph" w:styleId="a6">
+  <w:style w:type="paragraph" w:styleId="Footer">
     <w:name w:val="footer"/>
-    <w:basedOn w:val="a1"/>
-    <w:link w:val="Char0"/>
+    <w:basedOn w:val="Normal"/>
+    <w:link w:val="FooterChar"/>
     <w:uiPriority w:val="99"/>
     <w:unhideWhenUsed/>
     <w:rsid w:val="00E618BF"/>
@@ -5087,14 +4897,14 @@
       <w:spacing w:after="0" w:line="240" w:lineRule="auto"/>
     </w:pPr>
   </w:style>
-  <w:style w:type="character" w:customStyle="1" w:styleId="Char0">
-    <w:name w:val="바닥글 Char"/>
-    <w:basedOn w:val="a2"/>
-    <w:link w:val="a6"/>
+  <w:style w:type="character" w:customStyle="1" w:styleId="FooterChar">
+    <w:name w:val="Footer Char"/>
+    <w:basedOn w:val="DefaultParagraphFont"/>
+    <w:link w:val="Footer"/>
     <w:uiPriority w:val="99"/>
     <w:rsid w:val="00E618BF"/>
   </w:style>
-  <w:style w:type="paragraph" w:styleId="a7">
+  <w:style w:type="paragraph" w:styleId="NoSpacing">
     <w:name w:val="No Spacing"/>
     <w:uiPriority w:val="1"/>
     <w:qFormat/>
@@ -5103,10 +4913,10 @@
       <w:spacing w:after="0" w:line="240" w:lineRule="auto"/>
     </w:pPr>
   </w:style>
-  <w:style w:type="character" w:customStyle="1" w:styleId="1Char">
-    <w:name w:val="제목 1 Char"/>
-    <w:basedOn w:val="a2"/>
-    <w:link w:val="1"/>
+  <w:style w:type="character" w:customStyle="1" w:styleId="Heading1Char">
+    <w:name w:val="Heading 1 Char"/>
+    <w:basedOn w:val="DefaultParagraphFont"/>
+    <w:link w:val="Heading1"/>
     <w:uiPriority w:val="9"/>
     <w:rsid w:val="00FC693F"/>
     <w:rPr>
@@ -5118,10 +4928,10 @@
       <w:szCs w:val="28"/>
     </w:rPr>
   </w:style>
-  <w:style w:type="character" w:customStyle="1" w:styleId="2Char">
-    <w:name w:val="제목 2 Char"/>
-    <w:basedOn w:val="a2"/>
-    <w:link w:val="21"/>
+  <w:style w:type="character" w:customStyle="1" w:styleId="Heading2Char">
+    <w:name w:val="Heading 2 Char"/>
+    <w:basedOn w:val="DefaultParagraphFont"/>
+    <w:link w:val="Heading2"/>
     <w:uiPriority w:val="9"/>
     <w:rsid w:val="00FC693F"/>
     <w:rPr>
@@ -5133,10 +4943,10 @@
       <w:szCs w:val="26"/>
     </w:rPr>
   </w:style>
-  <w:style w:type="character" w:customStyle="1" w:styleId="3Char">
-    <w:name w:val="제목 3 Char"/>
-    <w:basedOn w:val="a2"/>
-    <w:link w:val="31"/>
+  <w:style w:type="character" w:customStyle="1" w:styleId="Heading3Char">
+    <w:name w:val="Heading 3 Char"/>
+    <w:basedOn w:val="DefaultParagraphFont"/>
+    <w:link w:val="Heading3"/>
     <w:uiPriority w:val="9"/>
     <w:rsid w:val="00FC693F"/>
     <w:rPr>
@@ -5146,11 +4956,11 @@
       <w:color w:val="4F81BD" w:themeColor="accent1"/>
     </w:rPr>
   </w:style>
-  <w:style w:type="paragraph" w:styleId="a8">
+  <w:style w:type="paragraph" w:styleId="Title">
     <w:name w:val="Title"/>
-    <w:basedOn w:val="a1"/>
-    <w:next w:val="a1"/>
-    <w:link w:val="Char1"/>
+    <w:basedOn w:val="Normal"/>
+    <w:next w:val="Normal"/>
+    <w:link w:val="TitleChar"/>
     <w:uiPriority w:val="10"/>
     <w:qFormat/>
     <w:rsid w:val="00FC693F"/>
@@ -5170,10 +4980,10 @@
       <w:szCs w:val="52"/>
     </w:rPr>
   </w:style>
-  <w:style w:type="character" w:customStyle="1" w:styleId="Char1">
-    <w:name w:val="제목 Char"/>
-    <w:basedOn w:val="a2"/>
-    <w:link w:val="a8"/>
+  <w:style w:type="character" w:customStyle="1" w:styleId="TitleChar">
+    <w:name w:val="Title Char"/>
+    <w:basedOn w:val="DefaultParagraphFont"/>
+    <w:link w:val="Title"/>
     <w:uiPriority w:val="10"/>
     <w:rsid w:val="00FC693F"/>
     <w:rPr>
@@ -5185,11 +4995,11 @@
       <w:szCs w:val="52"/>
     </w:rPr>
   </w:style>
-  <w:style w:type="paragraph" w:styleId="a9">
+  <w:style w:type="paragraph" w:styleId="Subtitle">
     <w:name w:val="Subtitle"/>
-    <w:basedOn w:val="a1"/>
-    <w:next w:val="a1"/>
-    <w:link w:val="Char2"/>
+    <w:basedOn w:val="Normal"/>
+    <w:next w:val="Normal"/>
+    <w:link w:val="SubtitleChar"/>
     <w:uiPriority w:val="11"/>
     <w:qFormat/>
     <w:rsid w:val="00FC693F"/>
@@ -5208,10 +5018,10 @@
       <w:szCs w:val="24"/>
     </w:rPr>
   </w:style>
-  <w:style w:type="character" w:customStyle="1" w:styleId="Char2">
-    <w:name w:val="부제 Char"/>
-    <w:basedOn w:val="a2"/>
-    <w:link w:val="a9"/>
+  <w:style w:type="character" w:customStyle="1" w:styleId="SubtitleChar">
+    <w:name w:val="Subtitle Char"/>
+    <w:basedOn w:val="DefaultParagraphFont"/>
+    <w:link w:val="Subtitle"/>
     <w:uiPriority w:val="11"/>
     <w:rsid w:val="00FC693F"/>
     <w:rPr>
@@ -5224,9 +5034,9 @@
       <w:szCs w:val="24"/>
     </w:rPr>
   </w:style>
-  <w:style w:type="paragraph" w:styleId="aa">
+  <w:style w:type="paragraph" w:styleId="ListParagraph">
     <w:name w:val="List Paragraph"/>
-    <w:basedOn w:val="a1"/>
+    <w:basedOn w:val="Normal"/>
     <w:uiPriority w:val="34"/>
     <w:qFormat/>
     <w:rsid w:val="00FC693F"/>
@@ -5235,10 +5045,10 @@
       <w:contextualSpacing/>
     </w:pPr>
   </w:style>
-  <w:style w:type="paragraph" w:styleId="ab">
+  <w:style w:type="paragraph" w:styleId="BodyText">
     <w:name w:val="Body Text"/>
-    <w:basedOn w:val="a1"/>
-    <w:link w:val="Char3"/>
+    <w:basedOn w:val="Normal"/>
+    <w:link w:val="BodyTextChar"/>
     <w:uiPriority w:val="99"/>
     <w:unhideWhenUsed/>
     <w:rsid w:val="00AA1D8D"/>
@@ -5246,17 +5056,17 @@
       <w:spacing w:after="120"/>
     </w:pPr>
   </w:style>
-  <w:style w:type="character" w:customStyle="1" w:styleId="Char3">
-    <w:name w:val="본문 Char"/>
-    <w:basedOn w:val="a2"/>
-    <w:link w:val="ab"/>
+  <w:style w:type="character" w:customStyle="1" w:styleId="BodyTextChar">
+    <w:name w:val="Body Text Char"/>
+    <w:basedOn w:val="DefaultParagraphFont"/>
+    <w:link w:val="BodyText"/>
     <w:uiPriority w:val="99"/>
     <w:rsid w:val="00AA1D8D"/>
   </w:style>
-  <w:style w:type="paragraph" w:styleId="22">
+  <w:style w:type="paragraph" w:styleId="BodyText2">
     <w:name w:val="Body Text 2"/>
-    <w:basedOn w:val="a1"/>
-    <w:link w:val="2Char0"/>
+    <w:basedOn w:val="Normal"/>
+    <w:link w:val="BodyText2Char"/>
     <w:uiPriority w:val="99"/>
     <w:unhideWhenUsed/>
     <w:rsid w:val="00AA1D8D"/>
@@ -5264,17 +5074,17 @@
       <w:spacing w:after="120" w:line="480" w:lineRule="auto"/>
     </w:pPr>
   </w:style>
-  <w:style w:type="character" w:customStyle="1" w:styleId="2Char0">
-    <w:name w:val="본문 2 Char"/>
-    <w:basedOn w:val="a2"/>
-    <w:link w:val="22"/>
+  <w:style w:type="character" w:customStyle="1" w:styleId="BodyText2Char">
+    <w:name w:val="Body Text 2 Char"/>
+    <w:basedOn w:val="DefaultParagraphFont"/>
+    <w:link w:val="BodyText2"/>
     <w:uiPriority w:val="99"/>
     <w:rsid w:val="00AA1D8D"/>
   </w:style>
-  <w:style w:type="paragraph" w:styleId="32">
+  <w:style w:type="paragraph" w:styleId="BodyText3">
     <w:name w:val="Body Text 3"/>
-    <w:basedOn w:val="a1"/>
-    <w:link w:val="3Char0"/>
+    <w:basedOn w:val="Normal"/>
+    <w:link w:val="BodyText3Char"/>
     <w:uiPriority w:val="99"/>
     <w:unhideWhenUsed/>
     <w:rsid w:val="00AA1D8D"/>
@@ -5286,10 +5096,10 @@
       <w:szCs w:val="16"/>
     </w:rPr>
   </w:style>
-  <w:style w:type="character" w:customStyle="1" w:styleId="3Char0">
-    <w:name w:val="본문 3 Char"/>
-    <w:basedOn w:val="a2"/>
-    <w:link w:val="32"/>
+  <w:style w:type="character" w:customStyle="1" w:styleId="BodyText3Char">
+    <w:name w:val="Body Text 3 Char"/>
+    <w:basedOn w:val="DefaultParagraphFont"/>
+    <w:link w:val="BodyText3"/>
     <w:uiPriority w:val="99"/>
     <w:rsid w:val="00AA1D8D"/>
     <w:rPr>
@@ -5297,9 +5107,9 @@
       <w:szCs w:val="16"/>
     </w:rPr>
   </w:style>
-  <w:style w:type="paragraph" w:styleId="ac">
+  <w:style w:type="paragraph" w:styleId="List">
     <w:name w:val="List"/>
-    <w:basedOn w:val="a1"/>
+    <w:basedOn w:val="Normal"/>
     <w:uiPriority w:val="99"/>
     <w:unhideWhenUsed/>
     <w:rsid w:val="00AA1D8D"/>
@@ -5308,9 +5118,9 @@
       <w:contextualSpacing/>
     </w:pPr>
   </w:style>
-  <w:style w:type="paragraph" w:styleId="23">
+  <w:style w:type="paragraph" w:styleId="List2">
     <w:name w:val="List 2"/>
-    <w:basedOn w:val="a1"/>
+    <w:basedOn w:val="Normal"/>
     <w:uiPriority w:val="99"/>
     <w:unhideWhenUsed/>
     <w:rsid w:val="00326F90"/>
@@ -5319,9 +5129,9 @@
       <w:contextualSpacing/>
     </w:pPr>
   </w:style>
-  <w:style w:type="paragraph" w:styleId="33">
+  <w:style w:type="paragraph" w:styleId="List3">
     <w:name w:val="List 3"/>
-    <w:basedOn w:val="a1"/>
+    <w:basedOn w:val="Normal"/>
     <w:uiPriority w:val="99"/>
     <w:unhideWhenUsed/>
     <w:rsid w:val="00326F90"/>
@@ -5330,9 +5140,9 @@
       <w:contextualSpacing/>
     </w:pPr>
   </w:style>
-  <w:style w:type="paragraph" w:styleId="a0">
+  <w:style w:type="paragraph" w:styleId="ListBullet">
     <w:name w:val="List Bullet"/>
-    <w:basedOn w:val="a1"/>
+    <w:basedOn w:val="Normal"/>
     <w:uiPriority w:val="99"/>
     <w:unhideWhenUsed/>
     <w:rsid w:val="00326F90"/>
@@ -5343,9 +5153,9 @@
       <w:contextualSpacing/>
     </w:pPr>
   </w:style>
-  <w:style w:type="paragraph" w:styleId="20">
+  <w:style w:type="paragraph" w:styleId="ListBullet2">
     <w:name w:val="List Bullet 2"/>
-    <w:basedOn w:val="a1"/>
+    <w:basedOn w:val="Normal"/>
     <w:uiPriority w:val="99"/>
     <w:unhideWhenUsed/>
     <w:rsid w:val="00326F90"/>
@@ -5356,9 +5166,9 @@
       <w:contextualSpacing/>
     </w:pPr>
   </w:style>
-  <w:style w:type="paragraph" w:styleId="30">
+  <w:style w:type="paragraph" w:styleId="ListBullet3">
     <w:name w:val="List Bullet 3"/>
-    <w:basedOn w:val="a1"/>
+    <w:basedOn w:val="Normal"/>
     <w:uiPriority w:val="99"/>
     <w:unhideWhenUsed/>
     <w:rsid w:val="00326F90"/>
@@ -5369,9 +5179,9 @@
       <w:contextualSpacing/>
     </w:pPr>
   </w:style>
-  <w:style w:type="paragraph" w:styleId="a">
+  <w:style w:type="paragraph" w:styleId="ListNumber">
     <w:name w:val="List Number"/>
-    <w:basedOn w:val="a1"/>
+    <w:basedOn w:val="Normal"/>
     <w:uiPriority w:val="99"/>
     <w:unhideWhenUsed/>
     <w:rsid w:val="00326F90"/>
@@ -5382,9 +5192,9 @@
       <w:contextualSpacing/>
     </w:pPr>
   </w:style>
-  <w:style w:type="paragraph" w:styleId="2">
+  <w:style w:type="paragraph" w:styleId="ListNumber2">
     <w:name w:val="List Number 2"/>
-    <w:basedOn w:val="a1"/>
+    <w:basedOn w:val="Normal"/>
     <w:uiPriority w:val="99"/>
     <w:unhideWhenUsed/>
     <w:rsid w:val="0029639D"/>
@@ -5395,9 +5205,9 @@
       <w:contextualSpacing/>
     </w:pPr>
   </w:style>
-  <w:style w:type="paragraph" w:styleId="3">
+  <w:style w:type="paragraph" w:styleId="ListNumber3">
     <w:name w:val="List Number 3"/>
-    <w:basedOn w:val="a1"/>
+    <w:basedOn w:val="Normal"/>
     <w:uiPriority w:val="99"/>
     <w:unhideWhenUsed/>
     <w:rsid w:val="0029639D"/>
@@ -5408,9 +5218,9 @@
       <w:contextualSpacing/>
     </w:pPr>
   </w:style>
-  <w:style w:type="paragraph" w:styleId="ad">
+  <w:style w:type="paragraph" w:styleId="ListContinue">
     <w:name w:val="List Continue"/>
-    <w:basedOn w:val="a1"/>
+    <w:basedOn w:val="Normal"/>
     <w:uiPriority w:val="99"/>
     <w:unhideWhenUsed/>
     <w:rsid w:val="0029639D"/>
@@ -5420,9 +5230,9 @@
       <w:contextualSpacing/>
     </w:pPr>
   </w:style>
-  <w:style w:type="paragraph" w:styleId="24">
+  <w:style w:type="paragraph" w:styleId="ListContinue2">
     <w:name w:val="List Continue 2"/>
-    <w:basedOn w:val="a1"/>
+    <w:basedOn w:val="Normal"/>
     <w:uiPriority w:val="99"/>
     <w:unhideWhenUsed/>
     <w:rsid w:val="0029639D"/>
@@ -5432,9 +5242,9 @@
       <w:contextualSpacing/>
     </w:pPr>
   </w:style>
-  <w:style w:type="paragraph" w:styleId="34">
+  <w:style w:type="paragraph" w:styleId="ListContinue3">
     <w:name w:val="List Continue 3"/>
-    <w:basedOn w:val="a1"/>
+    <w:basedOn w:val="Normal"/>
     <w:uiPriority w:val="99"/>
     <w:unhideWhenUsed/>
     <w:rsid w:val="0029639D"/>
@@ -5444,9 +5254,9 @@
       <w:contextualSpacing/>
     </w:pPr>
   </w:style>
-  <w:style w:type="paragraph" w:styleId="ae">
+  <w:style w:type="paragraph" w:styleId="MacroText">
     <w:name w:val="macro"/>
-    <w:link w:val="Char4"/>
+    <w:link w:val="MacroTextChar"/>
     <w:uiPriority w:val="99"/>
     <w:unhideWhenUsed/>
     <w:rsid w:val="0029639D"/>
@@ -5467,10 +5277,10 @@
       <w:szCs w:val="20"/>
     </w:rPr>
   </w:style>
-  <w:style w:type="character" w:customStyle="1" w:styleId="Char4">
-    <w:name w:val="매크로 텍스트 Char"/>
-    <w:basedOn w:val="a2"/>
-    <w:link w:val="ae"/>
+  <w:style w:type="character" w:customStyle="1" w:styleId="MacroTextChar">
+    <w:name w:val="Macro Text Char"/>
+    <w:basedOn w:val="DefaultParagraphFont"/>
+    <w:link w:val="MacroText"/>
     <w:uiPriority w:val="99"/>
     <w:rsid w:val="0029639D"/>
     <w:rPr>
@@ -5479,11 +5289,11 @@
       <w:szCs w:val="20"/>
     </w:rPr>
   </w:style>
-  <w:style w:type="paragraph" w:styleId="af">
+  <w:style w:type="paragraph" w:styleId="Quote">
     <w:name w:val="Quote"/>
-    <w:basedOn w:val="a1"/>
-    <w:next w:val="a1"/>
-    <w:link w:val="Char5"/>
+    <w:basedOn w:val="Normal"/>
+    <w:next w:val="Normal"/>
+    <w:link w:val="QuoteChar"/>
     <w:uiPriority w:val="29"/>
     <w:qFormat/>
     <w:rsid w:val="00FC693F"/>
@@ -5493,10 +5303,10 @@
       <w:color w:val="000000" w:themeColor="text1"/>
     </w:rPr>
   </w:style>
-  <w:style w:type="character" w:customStyle="1" w:styleId="Char5">
-    <w:name w:val="인용 Char"/>
-    <w:basedOn w:val="a2"/>
-    <w:link w:val="af"/>
+  <w:style w:type="character" w:customStyle="1" w:styleId="QuoteChar">
+    <w:name w:val="Quote Char"/>
+    <w:basedOn w:val="DefaultParagraphFont"/>
+    <w:link w:val="Quote"/>
     <w:uiPriority w:val="29"/>
     <w:rsid w:val="00FC693F"/>
     <w:rPr>
@@ -5505,10 +5315,10 @@
       <w:color w:val="000000" w:themeColor="text1"/>
     </w:rPr>
   </w:style>
-  <w:style w:type="character" w:customStyle="1" w:styleId="4Char">
-    <w:name w:val="제목 4 Char"/>
-    <w:basedOn w:val="a2"/>
-    <w:link w:val="4"/>
+  <w:style w:type="character" w:customStyle="1" w:styleId="Heading4Char">
+    <w:name w:val="Heading 4 Char"/>
+    <w:basedOn w:val="DefaultParagraphFont"/>
+    <w:link w:val="Heading4"/>
     <w:uiPriority w:val="9"/>
     <w:semiHidden/>
     <w:rsid w:val="00FC693F"/>
@@ -5521,10 +5331,10 @@
       <w:color w:val="4F81BD" w:themeColor="accent1"/>
     </w:rPr>
   </w:style>
-  <w:style w:type="character" w:customStyle="1" w:styleId="5Char">
-    <w:name w:val="제목 5 Char"/>
-    <w:basedOn w:val="a2"/>
-    <w:link w:val="5"/>
+  <w:style w:type="character" w:customStyle="1" w:styleId="Heading5Char">
+    <w:name w:val="Heading 5 Char"/>
+    <w:basedOn w:val="DefaultParagraphFont"/>
+    <w:link w:val="Heading5"/>
     <w:uiPriority w:val="9"/>
     <w:semiHidden/>
     <w:rsid w:val="00FC693F"/>
@@ -5533,10 +5343,10 @@
       <w:color w:val="243F60" w:themeColor="accent1" w:themeShade="7F"/>
     </w:rPr>
   </w:style>
-  <w:style w:type="character" w:customStyle="1" w:styleId="6Char">
-    <w:name w:val="제목 6 Char"/>
-    <w:basedOn w:val="a2"/>
-    <w:link w:val="6"/>
+  <w:style w:type="character" w:customStyle="1" w:styleId="Heading6Char">
+    <w:name w:val="Heading 6 Char"/>
+    <w:basedOn w:val="DefaultParagraphFont"/>
+    <w:link w:val="Heading6"/>
     <w:uiPriority w:val="9"/>
     <w:semiHidden/>
     <w:rsid w:val="00FC693F"/>
@@ -5547,10 +5357,10 @@
       <w:color w:val="243F60" w:themeColor="accent1" w:themeShade="7F"/>
     </w:rPr>
   </w:style>
-  <w:style w:type="character" w:customStyle="1" w:styleId="7Char">
-    <w:name w:val="제목 7 Char"/>
-    <w:basedOn w:val="a2"/>
-    <w:link w:val="7"/>
+  <w:style w:type="character" w:customStyle="1" w:styleId="Heading7Char">
+    <w:name w:val="Heading 7 Char"/>
+    <w:basedOn w:val="DefaultParagraphFont"/>
+    <w:link w:val="Heading7"/>
     <w:uiPriority w:val="9"/>
     <w:semiHidden/>
     <w:rsid w:val="00FC693F"/>
@@ -5561,10 +5371,10 @@
       <w:color w:val="404040" w:themeColor="text1" w:themeTint="BF"/>
     </w:rPr>
   </w:style>
-  <w:style w:type="character" w:customStyle="1" w:styleId="8Char">
-    <w:name w:val="제목 8 Char"/>
-    <w:basedOn w:val="a2"/>
-    <w:link w:val="8"/>
+  <w:style w:type="character" w:customStyle="1" w:styleId="Heading8Char">
+    <w:name w:val="Heading 8 Char"/>
+    <w:basedOn w:val="DefaultParagraphFont"/>
+    <w:link w:val="Heading8"/>
     <w:uiPriority w:val="9"/>
     <w:semiHidden/>
     <w:rsid w:val="00FC693F"/>
@@ -5575,10 +5385,10 @@
       <w:szCs w:val="20"/>
     </w:rPr>
   </w:style>
-  <w:style w:type="character" w:customStyle="1" w:styleId="9Char">
-    <w:name w:val="제목 9 Char"/>
-    <w:basedOn w:val="a2"/>
-    <w:link w:val="9"/>
+  <w:style w:type="character" w:customStyle="1" w:styleId="Heading9Char">
+    <w:name w:val="Heading 9 Char"/>
+    <w:basedOn w:val="DefaultParagraphFont"/>
+    <w:link w:val="Heading9"/>
     <w:uiPriority w:val="9"/>
     <w:semiHidden/>
     <w:rsid w:val="00FC693F"/>
@@ -5591,10 +5401,10 @@
       <w:szCs w:val="20"/>
     </w:rPr>
   </w:style>
-  <w:style w:type="paragraph" w:styleId="af0">
+  <w:style w:type="paragraph" w:styleId="Caption">
     <w:name w:val="caption"/>
-    <w:basedOn w:val="a1"/>
-    <w:next w:val="a1"/>
+    <w:basedOn w:val="Normal"/>
+    <w:next w:val="Normal"/>
     <w:uiPriority w:val="35"/>
     <w:semiHidden/>
     <w:unhideWhenUsed/>
@@ -5611,9 +5421,9 @@
       <w:szCs w:val="18"/>
     </w:rPr>
   </w:style>
-  <w:style w:type="character" w:styleId="af1">
+  <w:style w:type="character" w:styleId="Strong">
     <w:name w:val="Strong"/>
-    <w:basedOn w:val="a2"/>
+    <w:basedOn w:val="DefaultParagraphFont"/>
     <w:uiPriority w:val="22"/>
     <w:qFormat/>
     <w:rsid w:val="00FC693F"/>
@@ -5622,9 +5432,9 @@
       <w:bCs/>
     </w:rPr>
   </w:style>
-  <w:style w:type="character" w:styleId="af2">
+  <w:style w:type="character" w:styleId="Emphasis">
     <w:name w:val="Emphasis"/>
-    <w:basedOn w:val="a2"/>
+    <w:basedOn w:val="DefaultParagraphFont"/>
     <w:uiPriority w:val="20"/>
     <w:qFormat/>
     <w:rsid w:val="00FC693F"/>
@@ -5633,11 +5443,11 @@
       <w:iCs/>
     </w:rPr>
   </w:style>
-  <w:style w:type="paragraph" w:styleId="af3">
+  <w:style w:type="paragraph" w:styleId="IntenseQuote">
     <w:name w:val="Intense Quote"/>
-    <w:basedOn w:val="a1"/>
-    <w:next w:val="a1"/>
-    <w:link w:val="Char6"/>
+    <w:basedOn w:val="Normal"/>
+    <w:next w:val="Normal"/>
+    <w:link w:val="IntenseQuoteChar"/>
     <w:uiPriority w:val="30"/>
     <w:qFormat/>
     <w:rsid w:val="00FC693F"/>
@@ -5656,10 +5466,10 @@
       <w:color w:val="4F81BD" w:themeColor="accent1"/>
     </w:rPr>
   </w:style>
-  <w:style w:type="character" w:customStyle="1" w:styleId="Char6">
-    <w:name w:val="강한 인용 Char"/>
-    <w:basedOn w:val="a2"/>
-    <w:link w:val="af3"/>
+  <w:style w:type="character" w:customStyle="1" w:styleId="IntenseQuoteChar">
+    <w:name w:val="Intense Quote Char"/>
+    <w:basedOn w:val="DefaultParagraphFont"/>
+    <w:link w:val="IntenseQuote"/>
     <w:uiPriority w:val="30"/>
     <w:rsid w:val="00FC693F"/>
     <w:rPr>
@@ -5670,9 +5480,9 @@
       <w:color w:val="4F81BD" w:themeColor="accent1"/>
     </w:rPr>
   </w:style>
-  <w:style w:type="character" w:styleId="af4">
+  <w:style w:type="character" w:styleId="SubtleEmphasis">
     <w:name w:val="Subtle Emphasis"/>
-    <w:basedOn w:val="a2"/>
+    <w:basedOn w:val="DefaultParagraphFont"/>
     <w:uiPriority w:val="19"/>
     <w:qFormat/>
     <w:rsid w:val="00FC693F"/>
@@ -5682,9 +5492,9 @@
       <w:color w:val="808080" w:themeColor="text1" w:themeTint="7F"/>
     </w:rPr>
   </w:style>
-  <w:style w:type="character" w:styleId="af5">
+  <w:style w:type="character" w:styleId="IntenseEmphasis">
     <w:name w:val="Intense Emphasis"/>
-    <w:basedOn w:val="a2"/>
+    <w:basedOn w:val="DefaultParagraphFont"/>
     <w:uiPriority w:val="21"/>
     <w:qFormat/>
     <w:rsid w:val="00FC693F"/>
@@ -5696,9 +5506,9 @@
       <w:color w:val="4F81BD" w:themeColor="accent1"/>
     </w:rPr>
   </w:style>
-  <w:style w:type="character" w:styleId="af6">
+  <w:style w:type="character" w:styleId="SubtleReference">
     <w:name w:val="Subtle Reference"/>
-    <w:basedOn w:val="a2"/>
+    <w:basedOn w:val="DefaultParagraphFont"/>
     <w:uiPriority w:val="31"/>
     <w:qFormat/>
     <w:rsid w:val="00FC693F"/>
@@ -5708,9 +5518,9 @@
       <w:u w:val="single"/>
     </w:rPr>
   </w:style>
-  <w:style w:type="character" w:styleId="af7">
+  <w:style w:type="character" w:styleId="IntenseReference">
     <w:name w:val="Intense Reference"/>
-    <w:basedOn w:val="a2"/>
+    <w:basedOn w:val="DefaultParagraphFont"/>
     <w:uiPriority w:val="32"/>
     <w:qFormat/>
     <w:rsid w:val="00FC693F"/>
@@ -5723,9 +5533,9 @@
       <w:u w:val="single"/>
     </w:rPr>
   </w:style>
-  <w:style w:type="character" w:styleId="af8">
+  <w:style w:type="character" w:styleId="BookTitle">
     <w:name w:val="Book Title"/>
-    <w:basedOn w:val="a2"/>
+    <w:basedOn w:val="DefaultParagraphFont"/>
     <w:uiPriority w:val="33"/>
     <w:qFormat/>
     <w:rsid w:val="00FC693F"/>
@@ -5736,10 +5546,10 @@
       <w:spacing w:val="5"/>
     </w:rPr>
   </w:style>
-  <w:style w:type="paragraph" w:styleId="TOC">
+  <w:style w:type="paragraph" w:styleId="TOCHeading">
     <w:name w:val="TOC Heading"/>
-    <w:basedOn w:val="1"/>
-    <w:next w:val="a1"/>
+    <w:basedOn w:val="Heading1"/>
+    <w:next w:val="Normal"/>
     <w:uiPriority w:val="39"/>
     <w:semiHidden/>
     <w:unhideWhenUsed/>
@@ -5749,9 +5559,9 @@
       <w:outlineLvl w:val="9"/>
     </w:pPr>
   </w:style>
-  <w:style w:type="table" w:styleId="af9">
+  <w:style w:type="table" w:styleId="TableGrid">
     <w:name w:val="Table Grid"/>
-    <w:basedOn w:val="a3"/>
+    <w:basedOn w:val="TableNormal"/>
     <w:uiPriority w:val="59"/>
     <w:rsid w:val="00FC693F"/>
     <w:pPr>
@@ -5768,9 +5578,9 @@
       </w:tblBorders>
     </w:tblPr>
   </w:style>
-  <w:style w:type="table" w:styleId="afa">
+  <w:style w:type="table" w:styleId="LightShading">
     <w:name w:val="Light Shading"/>
-    <w:basedOn w:val="a3"/>
+    <w:basedOn w:val="TableNormal"/>
     <w:uiPriority w:val="60"/>
     <w:rsid w:val="00FC693F"/>
     <w:pPr>
@@ -5864,9 +5674,9 @@
       </w:tcPr>
     </w:tblStylePr>
   </w:style>
-  <w:style w:type="table" w:styleId="-1">
+  <w:style w:type="table" w:styleId="LightShading-Accent1">
     <w:name w:val="Light Shading Accent 1"/>
-    <w:basedOn w:val="a3"/>
+    <w:basedOn w:val="TableNormal"/>
     <w:uiPriority w:val="60"/>
     <w:rsid w:val="00FC693F"/>
     <w:pPr>
@@ -5960,9 +5770,9 @@
       </w:tcPr>
     </w:tblStylePr>
   </w:style>
-  <w:style w:type="table" w:styleId="-2">
+  <w:style w:type="table" w:styleId="LightShading-Accent2">
     <w:name w:val="Light Shading Accent 2"/>
-    <w:basedOn w:val="a3"/>
+    <w:basedOn w:val="TableNormal"/>
     <w:uiPriority w:val="60"/>
     <w:rsid w:val="00FC693F"/>
     <w:pPr>
@@ -6056,9 +5866,9 @@
       </w:tcPr>
     </w:tblStylePr>
   </w:style>
-  <w:style w:type="table" w:styleId="-3">
+  <w:style w:type="table" w:styleId="LightShading-Accent3">
     <w:name w:val="Light Shading Accent 3"/>
-    <w:basedOn w:val="a3"/>
+    <w:basedOn w:val="TableNormal"/>
     <w:uiPriority w:val="60"/>
     <w:rsid w:val="00FC693F"/>
     <w:pPr>
@@ -6152,9 +5962,9 @@
       </w:tcPr>
     </w:tblStylePr>
   </w:style>
-  <w:style w:type="table" w:styleId="-4">
+  <w:style w:type="table" w:styleId="LightShading-Accent4">
     <w:name w:val="Light Shading Accent 4"/>
-    <w:basedOn w:val="a3"/>
+    <w:basedOn w:val="TableNormal"/>
     <w:uiPriority w:val="60"/>
     <w:rsid w:val="00FC693F"/>
     <w:pPr>
@@ -6248,9 +6058,9 @@
       </w:tcPr>
     </w:tblStylePr>
   </w:style>
-  <w:style w:type="table" w:styleId="-5">
+  <w:style w:type="table" w:styleId="LightShading-Accent5">
     <w:name w:val="Light Shading Accent 5"/>
-    <w:basedOn w:val="a3"/>
+    <w:basedOn w:val="TableNormal"/>
     <w:uiPriority w:val="60"/>
     <w:rsid w:val="00FC693F"/>
     <w:pPr>
@@ -6344,9 +6154,9 @@
       </w:tcPr>
     </w:tblStylePr>
   </w:style>
-  <w:style w:type="table" w:styleId="-6">
+  <w:style w:type="table" w:styleId="LightShading-Accent6">
     <w:name w:val="Light Shading Accent 6"/>
-    <w:basedOn w:val="a3"/>
+    <w:basedOn w:val="TableNormal"/>
     <w:uiPriority w:val="60"/>
     <w:rsid w:val="00FC693F"/>
     <w:pPr>
@@ -6440,9 +6250,9 @@
       </w:tcPr>
     </w:tblStylePr>
   </w:style>
-  <w:style w:type="table" w:styleId="afb">
+  <w:style w:type="table" w:styleId="LightList">
     <w:name w:val="Light List"/>
-    <w:basedOn w:val="a3"/>
+    <w:basedOn w:val="TableNormal"/>
     <w:uiPriority w:val="61"/>
     <w:rsid w:val="00FC693F"/>
     <w:pPr>
@@ -6525,9 +6335,9 @@
       </w:tcPr>
     </w:tblStylePr>
   </w:style>
-  <w:style w:type="table" w:styleId="-10">
+  <w:style w:type="table" w:styleId="LightList-Accent1">
     <w:name w:val="Light List Accent 1"/>
-    <w:basedOn w:val="a3"/>
+    <w:basedOn w:val="TableNormal"/>
     <w:uiPriority w:val="61"/>
     <w:rsid w:val="00FC693F"/>
     <w:pPr>
@@ -6610,9 +6420,9 @@
       </w:tcPr>
     </w:tblStylePr>
   </w:style>
-  <w:style w:type="table" w:styleId="-20">
+  <w:style w:type="table" w:styleId="LightList-Accent2">
     <w:name w:val="Light List Accent 2"/>
-    <w:basedOn w:val="a3"/>
+    <w:basedOn w:val="TableNormal"/>
     <w:uiPriority w:val="61"/>
     <w:rsid w:val="00CB0664"/>
     <w:pPr>
@@ -6695,9 +6505,9 @@
       </w:tcPr>
     </w:tblStylePr>
   </w:style>
-  <w:style w:type="table" w:styleId="-30">
+  <w:style w:type="table" w:styleId="LightList-Accent3">
     <w:name w:val="Light List Accent 3"/>
-    <w:basedOn w:val="a3"/>
+    <w:basedOn w:val="TableNormal"/>
     <w:uiPriority w:val="61"/>
     <w:rsid w:val="00CB0664"/>
     <w:pPr>
@@ -6780,9 +6590,9 @@
       </w:tcPr>
     </w:tblStylePr>
   </w:style>
-  <w:style w:type="table" w:styleId="-40">
+  <w:style w:type="table" w:styleId="LightList-Accent4">
     <w:name w:val="Light List Accent 4"/>
-    <w:basedOn w:val="a3"/>
+    <w:basedOn w:val="TableNormal"/>
     <w:uiPriority w:val="61"/>
     <w:rsid w:val="00CB0664"/>
     <w:pPr>
@@ -6865,9 +6675,9 @@
       </w:tcPr>
     </w:tblStylePr>
   </w:style>
-  <w:style w:type="table" w:styleId="-50">
+  <w:style w:type="table" w:styleId="LightList-Accent5">
     <w:name w:val="Light List Accent 5"/>
-    <w:basedOn w:val="a3"/>
+    <w:basedOn w:val="TableNormal"/>
     <w:uiPriority w:val="61"/>
     <w:rsid w:val="00CB0664"/>
     <w:pPr>
@@ -6950,9 +6760,9 @@
       </w:tcPr>
     </w:tblStylePr>
   </w:style>
-  <w:style w:type="table" w:styleId="-60">
+  <w:style w:type="table" w:styleId="LightList-Accent6">
     <w:name w:val="Light List Accent 6"/>
-    <w:basedOn w:val="a3"/>
+    <w:basedOn w:val="TableNormal"/>
     <w:uiPriority w:val="61"/>
     <w:rsid w:val="00CB0664"/>
     <w:pPr>
@@ -7035,9 +6845,9 @@
       </w:tcPr>
     </w:tblStylePr>
   </w:style>
-  <w:style w:type="table" w:styleId="afc">
+  <w:style w:type="table" w:styleId="LightGrid">
     <w:name w:val="Light Grid"/>
-    <w:basedOn w:val="a3"/>
+    <w:basedOn w:val="TableNormal"/>
     <w:uiPriority w:val="62"/>
     <w:rsid w:val="00CB0664"/>
     <w:pPr>
@@ -7158,9 +6968,9 @@
       </w:tcPr>
     </w:tblStylePr>
   </w:style>
-  <w:style w:type="table" w:styleId="-11">
+  <w:style w:type="table" w:styleId="LightGrid-Accent1">
     <w:name w:val="Light Grid Accent 1"/>
-    <w:basedOn w:val="a3"/>
+    <w:basedOn w:val="TableNormal"/>
     <w:uiPriority w:val="62"/>
     <w:rsid w:val="00CB0664"/>
     <w:pPr>
@@ -7281,9 +7091,9 @@
       </w:tcPr>
     </w:tblStylePr>
   </w:style>
-  <w:style w:type="table" w:styleId="-21">
+  <w:style w:type="table" w:styleId="LightGrid-Accent2">
     <w:name w:val="Light Grid Accent 2"/>
-    <w:basedOn w:val="a3"/>
+    <w:basedOn w:val="TableNormal"/>
     <w:uiPriority w:val="62"/>
     <w:rsid w:val="00CB0664"/>
     <w:pPr>
@@ -7404,9 +7214,9 @@
       </w:tcPr>
     </w:tblStylePr>
   </w:style>
-  <w:style w:type="table" w:styleId="-31">
+  <w:style w:type="table" w:styleId="LightGrid-Accent3">
     <w:name w:val="Light Grid Accent 3"/>
-    <w:basedOn w:val="a3"/>
+    <w:basedOn w:val="TableNormal"/>
     <w:uiPriority w:val="62"/>
     <w:rsid w:val="00CB0664"/>
     <w:pPr>
@@ -7527,9 +7337,9 @@
       </w:tcPr>
     </w:tblStylePr>
   </w:style>
-  <w:style w:type="table" w:styleId="-41">
+  <w:style w:type="table" w:styleId="LightGrid-Accent4">
     <w:name w:val="Light Grid Accent 4"/>
-    <w:basedOn w:val="a3"/>
+    <w:basedOn w:val="TableNormal"/>
     <w:uiPriority w:val="62"/>
     <w:rsid w:val="00CB0664"/>
     <w:pPr>
@@ -7650,9 +7460,9 @@
       </w:tcPr>
     </w:tblStylePr>
   </w:style>
-  <w:style w:type="table" w:styleId="-51">
+  <w:style w:type="table" w:styleId="LightGrid-Accent5">
     <w:name w:val="Light Grid Accent 5"/>
-    <w:basedOn w:val="a3"/>
+    <w:basedOn w:val="TableNormal"/>
     <w:uiPriority w:val="62"/>
     <w:rsid w:val="00CB0664"/>
     <w:pPr>
@@ -7773,9 +7583,9 @@
       </w:tcPr>
     </w:tblStylePr>
   </w:style>
-  <w:style w:type="table" w:styleId="-61">
+  <w:style w:type="table" w:styleId="LightGrid-Accent6">
     <w:name w:val="Light Grid Accent 6"/>
-    <w:basedOn w:val="a3"/>
+    <w:basedOn w:val="TableNormal"/>
     <w:uiPriority w:val="62"/>
     <w:rsid w:val="00CB0664"/>
     <w:pPr>
@@ -7896,9 +7706,9 @@
       </w:tcPr>
     </w:tblStylePr>
   </w:style>
-  <w:style w:type="table" w:styleId="10">
+  <w:style w:type="table" w:styleId="MediumShading1">
     <w:name w:val="Medium Shading 1"/>
-    <w:basedOn w:val="a3"/>
+    <w:basedOn w:val="TableNormal"/>
     <w:uiPriority w:val="63"/>
     <w:rsid w:val="00CB0664"/>
     <w:pPr>
@@ -7995,9 +7805,9 @@
       </w:tcPr>
     </w:tblStylePr>
   </w:style>
-  <w:style w:type="table" w:styleId="1-1">
+  <w:style w:type="table" w:styleId="MediumShading1-Accent1">
     <w:name w:val="Medium Shading 1 Accent 1"/>
-    <w:basedOn w:val="a3"/>
+    <w:basedOn w:val="TableNormal"/>
     <w:uiPriority w:val="63"/>
     <w:rsid w:val="00CB0664"/>
     <w:pPr>
@@ -8094,9 +7904,9 @@
       </w:tcPr>
     </w:tblStylePr>
   </w:style>
-  <w:style w:type="table" w:styleId="1-2">
+  <w:style w:type="table" w:styleId="MediumShading1-Accent2">
     <w:name w:val="Medium Shading 1 Accent 2"/>
-    <w:basedOn w:val="a3"/>
+    <w:basedOn w:val="TableNormal"/>
     <w:uiPriority w:val="63"/>
     <w:rsid w:val="00CB0664"/>
     <w:pPr>
@@ -8193,9 +8003,9 @@
       </w:tcPr>
     </w:tblStylePr>
   </w:style>
-  <w:style w:type="table" w:styleId="1-3">
+  <w:style w:type="table" w:styleId="MediumShading1-Accent3">
     <w:name w:val="Medium Shading 1 Accent 3"/>
-    <w:basedOn w:val="a3"/>
+    <w:basedOn w:val="TableNormal"/>
     <w:uiPriority w:val="63"/>
     <w:rsid w:val="00CB0664"/>
     <w:pPr>
@@ -8292,9 +8102,9 @@
       </w:tcPr>
     </w:tblStylePr>
   </w:style>
-  <w:style w:type="table" w:styleId="1-4">
+  <w:style w:type="table" w:styleId="MediumShading1-Accent4">
     <w:name w:val="Medium Shading 1 Accent 4"/>
-    <w:basedOn w:val="a3"/>
+    <w:basedOn w:val="TableNormal"/>
     <w:uiPriority w:val="63"/>
     <w:rsid w:val="00CB0664"/>
     <w:pPr>
@@ -8391,9 +8201,9 @@
       </w:tcPr>
     </w:tblStylePr>
   </w:style>
-  <w:style w:type="table" w:styleId="1-5">
+  <w:style w:type="table" w:styleId="MediumShading1-Accent5">
     <w:name w:val="Medium Shading 1 Accent 5"/>
-    <w:basedOn w:val="a3"/>
+    <w:basedOn w:val="TableNormal"/>
     <w:uiPriority w:val="63"/>
     <w:rsid w:val="00CB0664"/>
     <w:pPr>
@@ -8490,9 +8300,9 @@
       </w:tcPr>
     </w:tblStylePr>
   </w:style>
-  <w:style w:type="table" w:styleId="1-6">
+  <w:style w:type="table" w:styleId="MediumShading1-Accent6">
     <w:name w:val="Medium Shading 1 Accent 6"/>
-    <w:basedOn w:val="a3"/>
+    <w:basedOn w:val="TableNormal"/>
     <w:uiPriority w:val="63"/>
     <w:rsid w:val="00CB0664"/>
     <w:pPr>
@@ -8589,9 +8399,9 @@
       </w:tcPr>
     </w:tblStylePr>
   </w:style>
-  <w:style w:type="table" w:styleId="25">
+  <w:style w:type="table" w:styleId="MediumShading2">
     <w:name w:val="Medium Shading 2"/>
-    <w:basedOn w:val="a3"/>
+    <w:basedOn w:val="TableNormal"/>
     <w:uiPriority w:val="64"/>
     <w:rsid w:val="00CB0664"/>
     <w:pPr>
@@ -8731,9 +8541,9 @@
       </w:tcPr>
     </w:tblStylePr>
   </w:style>
-  <w:style w:type="table" w:styleId="2-1">
+  <w:style w:type="table" w:styleId="MediumShading2-Accent1">
     <w:name w:val="Medium Shading 2 Accent 1"/>
-    <w:basedOn w:val="a3"/>
+    <w:basedOn w:val="TableNormal"/>
     <w:uiPriority w:val="64"/>
     <w:rsid w:val="00CB0664"/>
     <w:pPr>
@@ -8873,9 +8683,9 @@
       </w:tcPr>
     </w:tblStylePr>
   </w:style>
-  <w:style w:type="table" w:styleId="2-2">
+  <w:style w:type="table" w:styleId="MediumShading2-Accent2">
     <w:name w:val="Medium Shading 2 Accent 2"/>
-    <w:basedOn w:val="a3"/>
+    <w:basedOn w:val="TableNormal"/>
     <w:uiPriority w:val="64"/>
     <w:rsid w:val="00CB0664"/>
     <w:pPr>
@@ -9015,9 +8825,9 @@
       </w:tcPr>
     </w:tblStylePr>
   </w:style>
-  <w:style w:type="table" w:styleId="2-3">
+  <w:style w:type="table" w:styleId="MediumShading2-Accent3">
     <w:name w:val="Medium Shading 2 Accent 3"/>
-    <w:basedOn w:val="a3"/>
+    <w:basedOn w:val="TableNormal"/>
     <w:uiPriority w:val="64"/>
     <w:rsid w:val="00CB0664"/>
     <w:pPr>
@@ -9157,9 +8967,9 @@
       </w:tcPr>
     </w:tblStylePr>
   </w:style>
-  <w:style w:type="table" w:styleId="2-4">
+  <w:style w:type="table" w:styleId="MediumShading2-Accent4">
     <w:name w:val="Medium Shading 2 Accent 4"/>
-    <w:basedOn w:val="a3"/>
+    <w:basedOn w:val="TableNormal"/>
     <w:uiPriority w:val="64"/>
     <w:rsid w:val="00CB0664"/>
     <w:pPr>
@@ -9299,9 +9109,9 @@
       </w:tcPr>
     </w:tblStylePr>
   </w:style>
-  <w:style w:type="table" w:styleId="2-5">
+  <w:style w:type="table" w:styleId="MediumShading2-Accent5">
     <w:name w:val="Medium Shading 2 Accent 5"/>
-    <w:basedOn w:val="a3"/>
+    <w:basedOn w:val="TableNormal"/>
     <w:uiPriority w:val="64"/>
     <w:rsid w:val="00CB0664"/>
     <w:pPr>
@@ -9441,9 +9251,9 @@
       </w:tcPr>
     </w:tblStylePr>
   </w:style>
-  <w:style w:type="table" w:styleId="2-6">
+  <w:style w:type="table" w:styleId="MediumShading2-Accent6">
     <w:name w:val="Medium Shading 2 Accent 6"/>
-    <w:basedOn w:val="a3"/>
+    <w:basedOn w:val="TableNormal"/>
     <w:uiPriority w:val="64"/>
     <w:rsid w:val="00CB0664"/>
     <w:pPr>
@@ -9583,9 +9393,9 @@
       </w:tcPr>
     </w:tblStylePr>
   </w:style>
-  <w:style w:type="table" w:styleId="11">
+  <w:style w:type="table" w:styleId="MediumList1">
     <w:name w:val="Medium List 1"/>
-    <w:basedOn w:val="a3"/>
+    <w:basedOn w:val="TableNormal"/>
     <w:uiPriority w:val="65"/>
     <w:rsid w:val="00CB0664"/>
     <w:pPr>
@@ -9660,9 +9470,9 @@
       </w:tcPr>
     </w:tblStylePr>
   </w:style>
-  <w:style w:type="table" w:styleId="1-10">
+  <w:style w:type="table" w:styleId="MediumList1-Accent1">
     <w:name w:val="Medium List 1 Accent 1"/>
-    <w:basedOn w:val="a3"/>
+    <w:basedOn w:val="TableNormal"/>
     <w:uiPriority w:val="65"/>
     <w:rsid w:val="00CB0664"/>
     <w:pPr>
@@ -9737,9 +9547,9 @@
       </w:tcPr>
     </w:tblStylePr>
   </w:style>
-  <w:style w:type="table" w:styleId="1-20">
+  <w:style w:type="table" w:styleId="MediumList1-Accent2">
     <w:name w:val="Medium List 1 Accent 2"/>
-    <w:basedOn w:val="a3"/>
+    <w:basedOn w:val="TableNormal"/>
     <w:uiPriority w:val="65"/>
     <w:rsid w:val="00CB0664"/>
     <w:pPr>
@@ -9814,9 +9624,9 @@
       </w:tcPr>
     </w:tblStylePr>
   </w:style>
-  <w:style w:type="table" w:styleId="1-30">
+  <w:style w:type="table" w:styleId="MediumList1-Accent3">
     <w:name w:val="Medium List 1 Accent 3"/>
-    <w:basedOn w:val="a3"/>
+    <w:basedOn w:val="TableNormal"/>
     <w:uiPriority w:val="65"/>
     <w:rsid w:val="00CB0664"/>
     <w:pPr>
@@ -9891,9 +9701,9 @@
       </w:tcPr>
     </w:tblStylePr>
   </w:style>
-  <w:style w:type="table" w:styleId="1-40">
+  <w:style w:type="table" w:styleId="MediumList1-Accent4">
     <w:name w:val="Medium List 1 Accent 4"/>
-    <w:basedOn w:val="a3"/>
+    <w:basedOn w:val="TableNormal"/>
     <w:uiPriority w:val="65"/>
     <w:rsid w:val="00CB0664"/>
     <w:pPr>
@@ -9968,9 +9778,9 @@
       </w:tcPr>
     </w:tblStylePr>
   </w:style>
-  <w:style w:type="table" w:styleId="1-50">
+  <w:style w:type="table" w:styleId="MediumList1-Accent5">
     <w:name w:val="Medium List 1 Accent 5"/>
-    <w:basedOn w:val="a3"/>
+    <w:basedOn w:val="TableNormal"/>
     <w:uiPriority w:val="65"/>
     <w:rsid w:val="00CB0664"/>
     <w:pPr>
@@ -10045,9 +9855,9 @@
       </w:tcPr>
     </w:tblStylePr>
   </w:style>
-  <w:style w:type="table" w:styleId="1-60">
+  <w:style w:type="table" w:styleId="MediumList1-Accent6">
     <w:name w:val="Medium List 1 Accent 6"/>
-    <w:basedOn w:val="a3"/>
+    <w:basedOn w:val="TableNormal"/>
     <w:uiPriority w:val="65"/>
     <w:rsid w:val="00CB0664"/>
     <w:pPr>
@@ -10122,9 +9932,9 @@
       </w:tcPr>
     </w:tblStylePr>
   </w:style>
-  <w:style w:type="table" w:styleId="26">
+  <w:style w:type="table" w:styleId="MediumList2">
     <w:name w:val="Medium List 2"/>
-    <w:basedOn w:val="a3"/>
+    <w:basedOn w:val="TableNormal"/>
     <w:uiPriority w:val="66"/>
     <w:rsid w:val="00CB0664"/>
     <w:pPr>
@@ -10243,9 +10053,9 @@
       </w:tcPr>
     </w:tblStylePr>
   </w:style>
-  <w:style w:type="table" w:styleId="2-10">
+  <w:style w:type="table" w:styleId="MediumList2-Accent1">
     <w:name w:val="Medium List 2 Accent 1"/>
-    <w:basedOn w:val="a3"/>
+    <w:basedOn w:val="TableNormal"/>
     <w:uiPriority w:val="66"/>
     <w:rsid w:val="00CB0664"/>
     <w:pPr>
@@ -10364,9 +10174,9 @@
       </w:tcPr>
     </w:tblStylePr>
   </w:style>
-  <w:style w:type="table" w:styleId="2-20">
+  <w:style w:type="table" w:styleId="MediumList2-Accent2">
     <w:name w:val="Medium List 2 Accent 2"/>
-    <w:basedOn w:val="a3"/>
+    <w:basedOn w:val="TableNormal"/>
     <w:uiPriority w:val="66"/>
     <w:rsid w:val="00CB0664"/>
     <w:pPr>
@@ -10485,9 +10295,9 @@
       </w:tcPr>
     </w:tblStylePr>
   </w:style>
-  <w:style w:type="table" w:styleId="2-30">
+  <w:style w:type="table" w:styleId="MediumList2-Accent3">
     <w:name w:val="Medium List 2 Accent 3"/>
-    <w:basedOn w:val="a3"/>
+    <w:basedOn w:val="TableNormal"/>
     <w:uiPriority w:val="66"/>
     <w:rsid w:val="00CB0664"/>
     <w:pPr>
@@ -10606,9 +10416,9 @@
       </w:tcPr>
     </w:tblStylePr>
   </w:style>
-  <w:style w:type="table" w:styleId="2-40">
+  <w:style w:type="table" w:styleId="MediumList2-Accent4">
     <w:name w:val="Medium List 2 Accent 4"/>
-    <w:basedOn w:val="a3"/>
+    <w:basedOn w:val="TableNormal"/>
     <w:uiPriority w:val="66"/>
     <w:rsid w:val="00CB0664"/>
     <w:pPr>
@@ -10727,9 +10537,9 @@
       </w:tcPr>
     </w:tblStylePr>
   </w:style>
-  <w:style w:type="table" w:styleId="2-50">
+  <w:style w:type="table" w:styleId="MediumList2-Accent5">
     <w:name w:val="Medium List 2 Accent 5"/>
-    <w:basedOn w:val="a3"/>
+    <w:basedOn w:val="TableNormal"/>
     <w:uiPriority w:val="66"/>
     <w:rsid w:val="00CB0664"/>
     <w:pPr>
@@ -10848,9 +10658,9 @@
       </w:tcPr>
     </w:tblStylePr>
   </w:style>
-  <w:style w:type="table" w:styleId="2-60">
+  <w:style w:type="table" w:styleId="MediumList2-Accent6">
     <w:name w:val="Medium List 2 Accent 6"/>
-    <w:basedOn w:val="a3"/>
+    <w:basedOn w:val="TableNormal"/>
     <w:uiPriority w:val="66"/>
     <w:rsid w:val="00CB0664"/>
     <w:pPr>
@@ -10969,9 +10779,9 @@
       </w:tcPr>
     </w:tblStylePr>
   </w:style>
-  <w:style w:type="table" w:styleId="12">
+  <w:style w:type="table" w:styleId="MediumGrid1">
     <w:name w:val="Medium Grid 1"/>
-    <w:basedOn w:val="a3"/>
+    <w:basedOn w:val="TableNormal"/>
     <w:uiPriority w:val="67"/>
     <w:rsid w:val="00CB0664"/>
     <w:pPr>
@@ -11035,9 +10845,9 @@
       </w:tcPr>
     </w:tblStylePr>
   </w:style>
-  <w:style w:type="table" w:styleId="1-11">
+  <w:style w:type="table" w:styleId="MediumGrid1-Accent1">
     <w:name w:val="Medium Grid 1 Accent 1"/>
-    <w:basedOn w:val="a3"/>
+    <w:basedOn w:val="TableNormal"/>
     <w:uiPriority w:val="67"/>
     <w:rsid w:val="00CB0664"/>
     <w:pPr>
@@ -11101,9 +10911,9 @@
       </w:tcPr>
     </w:tblStylePr>
   </w:style>
-  <w:style w:type="table" w:styleId="1-21">
+  <w:style w:type="table" w:styleId="MediumGrid1-Accent2">
     <w:name w:val="Medium Grid 1 Accent 2"/>
-    <w:basedOn w:val="a3"/>
+    <w:basedOn w:val="TableNormal"/>
     <w:uiPriority w:val="67"/>
     <w:rsid w:val="00CB0664"/>
     <w:pPr>
@@ -11167,9 +10977,9 @@
       </w:tcPr>
     </w:tblStylePr>
   </w:style>
-  <w:style w:type="table" w:styleId="1-31">
+  <w:style w:type="table" w:styleId="MediumGrid1-Accent3">
     <w:name w:val="Medium Grid 1 Accent 3"/>
-    <w:basedOn w:val="a3"/>
+    <w:basedOn w:val="TableNormal"/>
     <w:uiPriority w:val="67"/>
     <w:rsid w:val="00CB0664"/>
     <w:pPr>
@@ -11233,9 +11043,9 @@
       </w:tcPr>
     </w:tblStylePr>
   </w:style>
-  <w:style w:type="table" w:styleId="1-41">
+  <w:style w:type="table" w:styleId="MediumGrid1-Accent4">
     <w:name w:val="Medium Grid 1 Accent 4"/>
-    <w:basedOn w:val="a3"/>
+    <w:basedOn w:val="TableNormal"/>
     <w:uiPriority w:val="67"/>
     <w:rsid w:val="00CB0664"/>
     <w:pPr>
@@ -11299,9 +11109,9 @@
       </w:tcPr>
     </w:tblStylePr>
   </w:style>
-  <w:style w:type="table" w:styleId="1-51">
+  <w:style w:type="table" w:styleId="MediumGrid1-Accent5">
     <w:name w:val="Medium Grid 1 Accent 5"/>
-    <w:basedOn w:val="a3"/>
+    <w:basedOn w:val="TableNormal"/>
     <w:uiPriority w:val="67"/>
     <w:rsid w:val="00CB0664"/>
     <w:pPr>
@@ -11365,9 +11175,9 @@
       </w:tcPr>
     </w:tblStylePr>
   </w:style>
-  <w:style w:type="table" w:styleId="1-61">
+  <w:style w:type="table" w:styleId="MediumGrid1-Accent6">
     <w:name w:val="Medium Grid 1 Accent 6"/>
-    <w:basedOn w:val="a3"/>
+    <w:basedOn w:val="TableNormal"/>
     <w:uiPriority w:val="67"/>
     <w:rsid w:val="00CB0664"/>
     <w:pPr>
@@ -11431,9 +11241,9 @@
       </w:tcPr>
     </w:tblStylePr>
   </w:style>
-  <w:style w:type="table" w:styleId="27">
+  <w:style w:type="table" w:styleId="MediumGrid2">
     <w:name w:val="Medium Grid 2"/>
-    <w:basedOn w:val="a3"/>
+    <w:basedOn w:val="TableNormal"/>
     <w:uiPriority w:val="68"/>
     <w:rsid w:val="00CB0664"/>
     <w:pPr>
@@ -11549,9 +11359,9 @@
       </w:tcPr>
     </w:tblStylePr>
   </w:style>
-  <w:style w:type="table" w:styleId="2-11">
+  <w:style w:type="table" w:styleId="MediumGrid2-Accent1">
     <w:name w:val="Medium Grid 2 Accent 1"/>
-    <w:basedOn w:val="a3"/>
+    <w:basedOn w:val="TableNormal"/>
     <w:uiPriority w:val="68"/>
     <w:rsid w:val="00CB0664"/>
     <w:pPr>
@@ -11667,9 +11477,9 @@
       </w:tcPr>
     </w:tblStylePr>
   </w:style>
-  <w:style w:type="table" w:styleId="2-21">
+  <w:style w:type="table" w:styleId="MediumGrid2-Accent2">
     <w:name w:val="Medium Grid 2 Accent 2"/>
-    <w:basedOn w:val="a3"/>
+    <w:basedOn w:val="TableNormal"/>
     <w:uiPriority w:val="68"/>
     <w:rsid w:val="00CB0664"/>
     <w:pPr>
@@ -11785,9 +11595,9 @@
       </w:tcPr>
     </w:tblStylePr>
   </w:style>
-  <w:style w:type="table" w:styleId="2-31">
+  <w:style w:type="table" w:styleId="MediumGrid2-Accent3">
     <w:name w:val="Medium Grid 2 Accent 3"/>
-    <w:basedOn w:val="a3"/>
+    <w:basedOn w:val="TableNormal"/>
     <w:uiPriority w:val="68"/>
     <w:rsid w:val="00CB0664"/>
     <w:pPr>
@@ -11903,9 +11713,9 @@
       </w:tcPr>
     </w:tblStylePr>
   </w:style>
-  <w:style w:type="table" w:styleId="2-41">
+  <w:style w:type="table" w:styleId="MediumGrid2-Accent4">
     <w:name w:val="Medium Grid 2 Accent 4"/>
-    <w:basedOn w:val="a3"/>
+    <w:basedOn w:val="TableNormal"/>
     <w:uiPriority w:val="68"/>
     <w:rsid w:val="00CB0664"/>
     <w:pPr>
@@ -12021,9 +11831,9 @@
       </w:tcPr>
     </w:tblStylePr>
   </w:style>
-  <w:style w:type="table" w:styleId="2-51">
+  <w:style w:type="table" w:styleId="MediumGrid2-Accent5">
     <w:name w:val="Medium Grid 2 Accent 5"/>
-    <w:basedOn w:val="a3"/>
+    <w:basedOn w:val="TableNormal"/>
     <w:uiPriority w:val="68"/>
     <w:rsid w:val="00CB0664"/>
     <w:pPr>
@@ -12139,9 +11949,9 @@
       </w:tcPr>
     </w:tblStylePr>
   </w:style>
-  <w:style w:type="table" w:styleId="2-61">
+  <w:style w:type="table" w:styleId="MediumGrid2-Accent6">
     <w:name w:val="Medium Grid 2 Accent 6"/>
-    <w:basedOn w:val="a3"/>
+    <w:basedOn w:val="TableNormal"/>
     <w:uiPriority w:val="68"/>
     <w:rsid w:val="00CB0664"/>
     <w:pPr>
@@ -12257,9 +12067,9 @@
       </w:tcPr>
     </w:tblStylePr>
   </w:style>
-  <w:style w:type="table" w:styleId="35">
+  <w:style w:type="table" w:styleId="MediumGrid3">
     <w:name w:val="Medium Grid 3"/>
-    <w:basedOn w:val="a3"/>
+    <w:basedOn w:val="TableNormal"/>
     <w:uiPriority w:val="69"/>
     <w:rsid w:val="00CB0664"/>
     <w:pPr>
@@ -12391,9 +12201,9 @@
       </w:tcPr>
     </w:tblStylePr>
   </w:style>
-  <w:style w:type="table" w:styleId="3-1">
+  <w:style w:type="table" w:styleId="MediumGrid3-Accent1">
     <w:name w:val="Medium Grid 3 Accent 1"/>
-    <w:basedOn w:val="a3"/>
+    <w:basedOn w:val="TableNormal"/>
     <w:uiPriority w:val="69"/>
     <w:rsid w:val="00CB0664"/>
     <w:pPr>
@@ -12525,9 +12335,9 @@
       </w:tcPr>
     </w:tblStylePr>
   </w:style>
-  <w:style w:type="table" w:styleId="3-2">
+  <w:style w:type="table" w:styleId="MediumGrid3-Accent2">
     <w:name w:val="Medium Grid 3 Accent 2"/>
-    <w:basedOn w:val="a3"/>
+    <w:basedOn w:val="TableNormal"/>
     <w:uiPriority w:val="69"/>
     <w:rsid w:val="00CB0664"/>
     <w:pPr>
@@ -12659,9 +12469,9 @@
       </w:tcPr>
     </w:tblStylePr>
   </w:style>
-  <w:style w:type="table" w:styleId="3-3">
+  <w:style w:type="table" w:styleId="MediumGrid3-Accent3">
     <w:name w:val="Medium Grid 3 Accent 3"/>
-    <w:basedOn w:val="a3"/>
+    <w:basedOn w:val="TableNormal"/>
     <w:uiPriority w:val="69"/>
     <w:rsid w:val="00CB0664"/>
     <w:pPr>
@@ -12793,9 +12603,9 @@
       </w:tcPr>
     </w:tblStylePr>
   </w:style>
-  <w:style w:type="table" w:styleId="3-4">
+  <w:style w:type="table" w:styleId="MediumGrid3-Accent4">
     <w:name w:val="Medium Grid 3 Accent 4"/>
-    <w:basedOn w:val="a3"/>
+    <w:basedOn w:val="TableNormal"/>
     <w:uiPriority w:val="69"/>
     <w:rsid w:val="00CB0664"/>
     <w:pPr>
@@ -12927,9 +12737,9 @@
       </w:tcPr>
     </w:tblStylePr>
   </w:style>
-  <w:style w:type="table" w:styleId="3-5">
+  <w:style w:type="table" w:styleId="MediumGrid3-Accent5">
     <w:name w:val="Medium Grid 3 Accent 5"/>
-    <w:basedOn w:val="a3"/>
+    <w:basedOn w:val="TableNormal"/>
     <w:uiPriority w:val="69"/>
     <w:rsid w:val="00CB0664"/>
     <w:pPr>
@@ -13061,9 +12871,9 @@
       </w:tcPr>
     </w:tblStylePr>
   </w:style>
-  <w:style w:type="table" w:styleId="3-6">
+  <w:style w:type="table" w:styleId="MediumGrid3-Accent6">
     <w:name w:val="Medium Grid 3 Accent 6"/>
-    <w:basedOn w:val="a3"/>
+    <w:basedOn w:val="TableNormal"/>
     <w:uiPriority w:val="69"/>
     <w:rsid w:val="00CB0664"/>
     <w:pPr>
@@ -13195,9 +13005,9 @@
       </w:tcPr>
     </w:tblStylePr>
   </w:style>
-  <w:style w:type="table" w:styleId="afd">
+  <w:style w:type="table" w:styleId="DarkList">
     <w:name w:val="Dark List"/>
-    <w:basedOn w:val="a3"/>
+    <w:basedOn w:val="TableNormal"/>
     <w:uiPriority w:val="70"/>
     <w:rsid w:val="00CB0664"/>
     <w:pPr>
@@ -13302,9 +13112,9 @@
       </w:tcPr>
     </w:tblStylePr>
   </w:style>
-  <w:style w:type="table" w:styleId="-12">
+  <w:style w:type="table" w:styleId="DarkList-Accent1">
     <w:name w:val="Dark List Accent 1"/>
-    <w:basedOn w:val="a3"/>
+    <w:basedOn w:val="TableNormal"/>
     <w:uiPriority w:val="70"/>
     <w:rsid w:val="00CB0664"/>
     <w:pPr>
@@ -13409,9 +13219,9 @@
       </w:tcPr>
     </w:tblStylePr>
   </w:style>
-  <w:style w:type="table" w:styleId="-22">
+  <w:style w:type="table" w:styleId="DarkList-Accent2">
     <w:name w:val="Dark List Accent 2"/>
-    <w:basedOn w:val="a3"/>
+    <w:basedOn w:val="TableNormal"/>
     <w:uiPriority w:val="70"/>
     <w:rsid w:val="00CB0664"/>
     <w:pPr>
@@ -13516,9 +13326,9 @@
       </w:tcPr>
     </w:tblStylePr>
   </w:style>
-  <w:style w:type="table" w:styleId="-32">
+  <w:style w:type="table" w:styleId="DarkList-Accent3">
     <w:name w:val="Dark List Accent 3"/>
-    <w:basedOn w:val="a3"/>
+    <w:basedOn w:val="TableNormal"/>
     <w:uiPriority w:val="70"/>
     <w:rsid w:val="00CB0664"/>
     <w:pPr>
@@ -13623,9 +13433,9 @@
       </w:tcPr>
     </w:tblStylePr>
   </w:style>
-  <w:style w:type="table" w:styleId="-42">
+  <w:style w:type="table" w:styleId="DarkList-Accent4">
     <w:name w:val="Dark List Accent 4"/>
-    <w:basedOn w:val="a3"/>
+    <w:basedOn w:val="TableNormal"/>
     <w:uiPriority w:val="70"/>
     <w:rsid w:val="00CB0664"/>
     <w:pPr>
@@ -13730,9 +13540,9 @@
       </w:tcPr>
     </w:tblStylePr>
   </w:style>
-  <w:style w:type="table" w:styleId="-52">
+  <w:style w:type="table" w:styleId="DarkList-Accent5">
     <w:name w:val="Dark List Accent 5"/>
-    <w:basedOn w:val="a3"/>
+    <w:basedOn w:val="TableNormal"/>
     <w:uiPriority w:val="70"/>
     <w:rsid w:val="00CB0664"/>
     <w:pPr>
@@ -13837,9 +13647,9 @@
       </w:tcPr>
     </w:tblStylePr>
   </w:style>
-  <w:style w:type="table" w:styleId="-62">
+  <w:style w:type="table" w:styleId="DarkList-Accent6">
     <w:name w:val="Dark List Accent 6"/>
-    <w:basedOn w:val="a3"/>
+    <w:basedOn w:val="TableNormal"/>
     <w:uiPriority w:val="70"/>
     <w:rsid w:val="00CB0664"/>
     <w:pPr>
@@ -13944,9 +13754,9 @@
       </w:tcPr>
     </w:tblStylePr>
   </w:style>
-  <w:style w:type="table" w:styleId="afe">
+  <w:style w:type="table" w:styleId="ColorfulShading">
     <w:name w:val="Colorful Shading"/>
-    <w:basedOn w:val="a3"/>
+    <w:basedOn w:val="TableNormal"/>
     <w:uiPriority w:val="71"/>
     <w:rsid w:val="00CB0664"/>
     <w:pPr>
@@ -14059,9 +13869,9 @@
       </w:rPr>
     </w:tblStylePr>
   </w:style>
-  <w:style w:type="table" w:styleId="-13">
+  <w:style w:type="table" w:styleId="ColorfulShading-Accent1">
     <w:name w:val="Colorful Shading Accent 1"/>
-    <w:basedOn w:val="a3"/>
+    <w:basedOn w:val="TableNormal"/>
     <w:uiPriority w:val="71"/>
     <w:rsid w:val="00CB0664"/>
     <w:pPr>
@@ -14174,9 +13984,9 @@
       </w:rPr>
     </w:tblStylePr>
   </w:style>
-  <w:style w:type="table" w:styleId="-23">
+  <w:style w:type="table" w:styleId="ColorfulShading-Accent2">
     <w:name w:val="Colorful Shading Accent 2"/>
-    <w:basedOn w:val="a3"/>
+    <w:basedOn w:val="TableNormal"/>
     <w:uiPriority w:val="71"/>
     <w:rsid w:val="00CB0664"/>
     <w:pPr>
@@ -14289,9 +14099,9 @@
       </w:rPr>
     </w:tblStylePr>
   </w:style>
-  <w:style w:type="table" w:styleId="-33">
+  <w:style w:type="table" w:styleId="ColorfulShading-Accent3">
     <w:name w:val="Colorful Shading Accent 3"/>
-    <w:basedOn w:val="a3"/>
+    <w:basedOn w:val="TableNormal"/>
     <w:uiPriority w:val="71"/>
     <w:rsid w:val="00CB0664"/>
     <w:pPr>
@@ -14394,9 +14204,9 @@
       </w:tcPr>
     </w:tblStylePr>
   </w:style>
-  <w:style w:type="table" w:styleId="-43">
+  <w:style w:type="table" w:styleId="ColorfulShading-Accent4">
     <w:name w:val="Colorful Shading Accent 4"/>
-    <w:basedOn w:val="a3"/>
+    <w:basedOn w:val="TableNormal"/>
     <w:uiPriority w:val="71"/>
     <w:rsid w:val="00CB0664"/>
     <w:pPr>
@@ -14509,9 +14319,9 @@
       </w:rPr>
     </w:tblStylePr>
   </w:style>
-  <w:style w:type="table" w:styleId="-53">
+  <w:style w:type="table" w:styleId="ColorfulShading-Accent5">
     <w:name w:val="Colorful Shading Accent 5"/>
-    <w:basedOn w:val="a3"/>
+    <w:basedOn w:val="TableNormal"/>
     <w:uiPriority w:val="71"/>
     <w:rsid w:val="00CB0664"/>
     <w:pPr>
@@ -14624,9 +14434,9 @@
       </w:rPr>
     </w:tblStylePr>
   </w:style>
-  <w:style w:type="table" w:styleId="-63">
+  <w:style w:type="table" w:styleId="ColorfulShading-Accent6">
     <w:name w:val="Colorful Shading Accent 6"/>
-    <w:basedOn w:val="a3"/>
+    <w:basedOn w:val="TableNormal"/>
     <w:uiPriority w:val="71"/>
     <w:rsid w:val="00CB0664"/>
     <w:pPr>
@@ -14739,9 +14549,9 @@
       </w:rPr>
     </w:tblStylePr>
   </w:style>
-  <w:style w:type="table" w:styleId="aff">
+  <w:style w:type="table" w:styleId="ColorfulList">
     <w:name w:val="Colorful List"/>
-    <w:basedOn w:val="a3"/>
+    <w:basedOn w:val="TableNormal"/>
     <w:uiPriority w:val="72"/>
     <w:rsid w:val="00CB0664"/>
     <w:pPr>
@@ -14818,9 +14628,9 @@
       </w:tcPr>
     </w:tblStylePr>
   </w:style>
-  <w:style w:type="table" w:styleId="-14">
+  <w:style w:type="table" w:styleId="ColorfulList-Accent1">
     <w:name w:val="Colorful List Accent 1"/>
-    <w:basedOn w:val="a3"/>
+    <w:basedOn w:val="TableNormal"/>
     <w:uiPriority w:val="72"/>
     <w:rsid w:val="00CB0664"/>
     <w:pPr>
@@ -14897,9 +14707,9 @@
       </w:tcPr>
     </w:tblStylePr>
   </w:style>
-  <w:style w:type="table" w:styleId="-24">
+  <w:style w:type="table" w:styleId="ColorfulList-Accent2">
     <w:name w:val="Colorful List Accent 2"/>
-    <w:basedOn w:val="a3"/>
+    <w:basedOn w:val="TableNormal"/>
     <w:uiPriority w:val="72"/>
     <w:rsid w:val="00CB0664"/>
     <w:pPr>
@@ -14976,9 +14786,9 @@
       </w:tcPr>
     </w:tblStylePr>
   </w:style>
-  <w:style w:type="table" w:styleId="-34">
+  <w:style w:type="table" w:styleId="ColorfulList-Accent3">
     <w:name w:val="Colorful List Accent 3"/>
-    <w:basedOn w:val="a3"/>
+    <w:basedOn w:val="TableNormal"/>
     <w:uiPriority w:val="72"/>
     <w:rsid w:val="00CB0664"/>
     <w:pPr>
@@ -15055,9 +14865,9 @@
       </w:tcPr>
     </w:tblStylePr>
   </w:style>
-  <w:style w:type="table" w:styleId="-44">
+  <w:style w:type="table" w:styleId="ColorfulList-Accent4">
     <w:name w:val="Colorful List Accent 4"/>
-    <w:basedOn w:val="a3"/>
+    <w:basedOn w:val="TableNormal"/>
     <w:uiPriority w:val="72"/>
     <w:rsid w:val="00CB0664"/>
     <w:pPr>
@@ -15134,9 +14944,9 @@
       </w:tcPr>
     </w:tblStylePr>
   </w:style>
-  <w:style w:type="table" w:styleId="-54">
+  <w:style w:type="table" w:styleId="ColorfulList-Accent5">
     <w:name w:val="Colorful List Accent 5"/>
-    <w:basedOn w:val="a3"/>
+    <w:basedOn w:val="TableNormal"/>
     <w:uiPriority w:val="72"/>
     <w:rsid w:val="00CB0664"/>
     <w:pPr>
@@ -15213,9 +15023,9 @@
       </w:tcPr>
     </w:tblStylePr>
   </w:style>
-  <w:style w:type="table" w:styleId="-64">
+  <w:style w:type="table" w:styleId="ColorfulList-Accent6">
     <w:name w:val="Colorful List Accent 6"/>
-    <w:basedOn w:val="a3"/>
+    <w:basedOn w:val="TableNormal"/>
     <w:uiPriority w:val="72"/>
     <w:rsid w:val="00CB0664"/>
     <w:pPr>
@@ -15292,9 +15102,9 @@
       </w:tcPr>
     </w:tblStylePr>
   </w:style>
-  <w:style w:type="table" w:styleId="aff0">
+  <w:style w:type="table" w:styleId="ColorfulGrid">
     <w:name w:val="Colorful Grid"/>
-    <w:basedOn w:val="a3"/>
+    <w:basedOn w:val="TableNormal"/>
     <w:uiPriority w:val="73"/>
     <w:rsid w:val="00CB0664"/>
     <w:pPr>
@@ -15365,9 +15175,9 @@
       </w:tcPr>
     </w:tblStylePr>
   </w:style>
-  <w:style w:type="table" w:styleId="-15">
+  <w:style w:type="table" w:styleId="ColorfulGrid-Accent1">
     <w:name w:val="Colorful Grid Accent 1"/>
-    <w:basedOn w:val="a3"/>
+    <w:basedOn w:val="TableNormal"/>
     <w:uiPriority w:val="73"/>
     <w:rsid w:val="00CB0664"/>
     <w:pPr>
@@ -15438,9 +15248,9 @@
       </w:tcPr>
     </w:tblStylePr>
   </w:style>
-  <w:style w:type="table" w:styleId="-25">
+  <w:style w:type="table" w:styleId="ColorfulGrid-Accent2">
     <w:name w:val="Colorful Grid Accent 2"/>
-    <w:basedOn w:val="a3"/>
+    <w:basedOn w:val="TableNormal"/>
     <w:uiPriority w:val="73"/>
     <w:rsid w:val="00CB0664"/>
     <w:pPr>
@@ -15511,9 +15321,9 @@
       </w:tcPr>
     </w:tblStylePr>
   </w:style>
-  <w:style w:type="table" w:styleId="-35">
+  <w:style w:type="table" w:styleId="ColorfulGrid-Accent3">
     <w:name w:val="Colorful Grid Accent 3"/>
-    <w:basedOn w:val="a3"/>
+    <w:basedOn w:val="TableNormal"/>
     <w:uiPriority w:val="73"/>
     <w:rsid w:val="00CB0664"/>
     <w:pPr>
@@ -15584,9 +15394,9 @@
       </w:tcPr>
     </w:tblStylePr>
   </w:style>
-  <w:style w:type="table" w:styleId="-45">
+  <w:style w:type="table" w:styleId="ColorfulGrid-Accent4">
     <w:name w:val="Colorful Grid Accent 4"/>
-    <w:basedOn w:val="a3"/>
+    <w:basedOn w:val="TableNormal"/>
     <w:uiPriority w:val="73"/>
     <w:rsid w:val="00CB0664"/>
     <w:pPr>
@@ -15657,9 +15467,9 @@
       </w:tcPr>
     </w:tblStylePr>
   </w:style>
-  <w:style w:type="table" w:styleId="-55">
+  <w:style w:type="table" w:styleId="ColorfulGrid-Accent5">
     <w:name w:val="Colorful Grid Accent 5"/>
-    <w:basedOn w:val="a3"/>
+    <w:basedOn w:val="TableNormal"/>
     <w:uiPriority w:val="73"/>
     <w:rsid w:val="00CB0664"/>
     <w:pPr>
@@ -15730,9 +15540,9 @@
       </w:tcPr>
     </w:tblStylePr>
   </w:style>
-  <w:style w:type="table" w:styleId="-65">
+  <w:style w:type="table" w:styleId="ColorfulGrid-Accent6">
     <w:name w:val="Colorful Grid Accent 6"/>
-    <w:basedOn w:val="a3"/>
+    <w:basedOn w:val="TableNormal"/>
     <w:uiPriority w:val="73"/>
     <w:rsid w:val="00CB0664"/>
     <w:pPr>

</xml_diff>